<commit_message>
I modified the readme file to include the information of the first manuscript
</commit_message>
<xml_diff>
--- a/Mution-breeding-and-Genomic-Selection-in-Taro.docx
+++ b/Mution-breeding-and-Genomic-Selection-in-Taro.docx
@@ -26,7 +26,7 @@
         <w:t xml:space="preserve">2026-08-31</w:t>
       </w:r>
     </w:p>
-    <w:bookmarkStart w:id="19" w:name="Xc2cce3f02a31dc3a1f22b1cace33d58e29ae6d7"/>
+    <w:bookmarkStart w:id="21" w:name="Xc2cce3f02a31dc3a1f22b1cace33d58e29ae6d7"/>
     <w:p>
       <w:pPr>
         <w:pStyle w:val="Heading3"/>
@@ -107,7 +107,16 @@
         <w:pStyle w:val="FirstParagraph"/>
       </w:pPr>
       <w:r>
-        <w:t xml:space="preserve">Mutation is a change in the nucleotide sequence of a short region of a genome. Mutation occurs either due to error in the DNA replication or from the effect of mutagens sush as chemicals heat and irradiation leading to heritable genetic changes. These changes can be in form of point mutation - replaces one nucleotide with another other; deletion or insertion of one or a few nucleotide.</w:t>
+        <w:t xml:space="preserve">Mutation is a change in the nucleotide sequence of a short region of a genome. Mutation occurs either due to error in the DNA replication or from the effect of mutagens sush as chemicals, heat and irradiation leading to structural changes n the DNA. these changes are inheritable. the change isuakly affect on one strand of the parent double helix. that is only one strand carries the mutation</w:t>
+      </w:r>
+      <w:r>
+        <w:t xml:space="preserve"> </w:t>
+      </w:r>
+      <w:r>
+        <w:t xml:space="preserve">(Brown 2002)</w:t>
+      </w:r>
+      <w:r>
+        <w:t xml:space="preserve">. These changes can be in form of point mutation - replaces one nucleotide with another other; deletion or insertion of one or a few nucleotide.</w:t>
       </w:r>
     </w:p>
     <w:bookmarkEnd w:id="10"/>
@@ -135,7 +144,7 @@
       </w:r>
     </w:p>
     <w:bookmarkEnd w:id="11"/>
-    <w:bookmarkStart w:id="18" w:name="X53bfa4b6802512ded6a17f04feab927a2cce647"/>
+    <w:bookmarkStart w:id="20" w:name="X53bfa4b6802512ded6a17f04feab927a2cce647"/>
     <w:p>
       <w:pPr>
         <w:pStyle w:val="Heading4"/>
@@ -191,8 +200,45 @@
         </w:drawing>
       </w:r>
     </w:p>
-    <w:bookmarkStart w:id="17" w:name="refs"/>
-    <w:bookmarkStart w:id="16" w:name="ref-cvejic2026"/>
+    <w:bookmarkStart w:id="19" w:name="refs"/>
+    <w:bookmarkStart w:id="16" w:name="ref-brown2002"/>
+    <w:p>
+      <w:pPr>
+        <w:pStyle w:val="Bibliography"/>
+      </w:pPr>
+      <w:r>
+        <w:t xml:space="preserve">Brown, Terence A. 2002.</w:t>
+      </w:r>
+      <w:r>
+        <w:t xml:space="preserve"> </w:t>
+      </w:r>
+      <w:r>
+        <w:rPr>
+          <w:i/>
+          <w:iCs/>
+        </w:rPr>
+        <w:t xml:space="preserve">Mutation, Repair and Recombination</w:t>
+      </w:r>
+      <w:r>
+        <w:t xml:space="preserve">. Wiley-Liss.</w:t>
+      </w:r>
+      <w:r>
+        <w:t xml:space="preserve"> </w:t>
+      </w:r>
+      <w:hyperlink r:id="rId15">
+        <w:r>
+          <w:rPr>
+            <w:rStyle w:val="Hyperlink"/>
+          </w:rPr>
+          <w:t xml:space="preserve">https://www.ncbi.nlm.nih.gov/books/NBK21114/</w:t>
+        </w:r>
+      </w:hyperlink>
+      <w:r>
+        <w:t xml:space="preserve">.</w:t>
+      </w:r>
+    </w:p>
+    <w:bookmarkEnd w:id="16"/>
+    <w:bookmarkStart w:id="18" w:name="ref-cvejic2026"/>
     <w:p>
       <w:pPr>
         <w:pStyle w:val="Bibliography"/>
@@ -225,7 +271,7 @@
       <w:r>
         <w:t xml:space="preserve"> </w:t>
       </w:r>
-      <w:hyperlink r:id="rId15">
+      <w:hyperlink r:id="rId17">
         <w:r>
           <w:rPr>
             <w:rStyle w:val="Hyperlink"/>
@@ -237,10 +283,10 @@
         <w:t xml:space="preserve">.</w:t>
       </w:r>
     </w:p>
-    <w:bookmarkEnd w:id="16"/>
-    <w:bookmarkEnd w:id="17"/>
     <w:bookmarkEnd w:id="18"/>
     <w:bookmarkEnd w:id="19"/>
+    <w:bookmarkEnd w:id="20"/>
+    <w:bookmarkEnd w:id="21"/>
     <w:sectPr>
       <w:footnotePr>
         <w:numRestart w:val="eachSect"/>

</xml_diff>

<commit_message>
I included large scale mutation to the writeup.
</commit_message>
<xml_diff>
--- a/Mution-breeding-and-Genomic-Selection-in-Taro.docx
+++ b/Mution-breeding-and-Genomic-Selection-in-Taro.docx
@@ -23,10 +23,10 @@
         <w:pStyle w:val="Date"/>
       </w:pPr>
       <w:r>
-        <w:t xml:space="preserve">2026-09-01</w:t>
-      </w:r>
-    </w:p>
-    <w:bookmarkStart w:id="21" w:name="Xc2cce3f02a31dc3a1f22b1cace33d58e29ae6d7"/>
+        <w:t xml:space="preserve">2026-09-03</w:t>
+      </w:r>
+    </w:p>
+    <w:bookmarkStart w:id="22" w:name="Xc2cce3f02a31dc3a1f22b1cace33d58e29ae6d7"/>
     <w:p>
       <w:pPr>
         <w:pStyle w:val="Heading3"/>
@@ -40,6 +40,16 @@
         <w:pStyle w:val="FirstParagraph"/>
       </w:pPr>
       <w:r>
+        <w:rPr>
+          <w:b/>
+          <w:bCs/>
+        </w:rPr>
+        <w:t xml:space="preserve">Introduction</w:t>
+      </w:r>
+      <w:r>
+        <w:t xml:space="preserve"> </w:t>
+      </w:r>
+      <w:r>
         <w:t xml:space="preserve">Taro is one of the important root crops in Nigeria and other tropical countries. It is food for – people in the world ().</w:t>
       </w:r>
     </w:p>
@@ -81,7 +91,7 @@
         <w:pStyle w:val="FirstParagraph"/>
       </w:pPr>
       <w:r>
-        <w:t xml:space="preserve">Taro is usually cultivated vegetatively using the corms and the cormels this is because of the firstly most taro varieties do not flow and or have produce poor seeds and secondly the onset of disease intercepts the time of flower maturation leading to the death of most of the plant hence lack of seeds available for the next planting season.</w:t>
+        <w:t xml:space="preserve">Taro is usually cultivated vegetatively using the corms and the cormels this is because of the firstly most taro varieties do not flower and or have produce poor seeds and secondly the onset of disease intercepts the time of flower maturation leading to the death of most of the plant hence lack of seeds available for the next planting season. this is a major bottle neck of tara improvement.</w:t>
       </w:r>
     </w:p>
     <w:p>
@@ -89,7 +99,7 @@
         <w:pStyle w:val="BodyText"/>
       </w:pPr>
       <w:r>
-        <w:t xml:space="preserve">Taro breeders are looking for ways to overcome the problem of seed availability and have employed method such as staggering the planting time to escape disease the peak of disease outbreak. Mutation breeding is one ,method that breeders can employ to increase genetic diversity of taro. We have to understand what mutation is before understanding what mutation breeding is.</w:t>
+        <w:t xml:space="preserve">Taro breeders are seeking for ways to overcome the problem of seed availability and have employed method such as staggering the planting time to escape disease the peak of disease outbreak. Mutation breeding is one method that breeders can employ to increase genetic diversity of taro. there is need to understand what mutation is before we think of mutation breeding</w:t>
       </w:r>
     </w:p>
     <w:bookmarkEnd w:id="9"/>
@@ -107,7 +117,7 @@
         <w:pStyle w:val="FirstParagraph"/>
       </w:pPr>
       <w:r>
-        <w:t xml:space="preserve">Mutation is a change in the nucleotide sequence of a short region of a genome. Mutation occurs either due to error in the DNA replication or from the effect of mutagens sush as chemicals, heat and irradiation leading to structural changes n the DNA. these changes are inheritable. the change isuakly affect on one strand of the parent double helix. that is only one strand carries the mutation</w:t>
+        <w:t xml:space="preserve">Mutation is a change in the nucleotide sequence of a short region of a genome. Mutation occurs either due to error in the DNA replication or from the effect of mutagens such as chemicals, heat and irradiation leading to structural changes n the DNA. The change usually affect on one strand of the parent double helix. that is only one strand carries the mutation</w:t>
       </w:r>
       <w:r>
         <w:t xml:space="preserve"> </w:t>
@@ -116,17 +126,39 @@
         <w:t xml:space="preserve">(Brown 2002)</w:t>
       </w:r>
       <w:r>
-        <w:t xml:space="preserve">. These changes can be in form of point mutation - replaces one nucleotide with another other; deletion or insertion of one or a few nucleotide.</w:t>
+        <w:t xml:space="preserve">. Mutation occur in small or large scale.</w:t>
+      </w:r>
+      <w:r>
+        <w:t xml:space="preserve"> </w:t>
+      </w:r>
+      <w:r>
+        <w:t xml:space="preserve">Small scale mutation involves changes in one or few nucleotide. Small scale mutation includes deletion, insertion and substitution of one or few nucleotide. Substitution is also called point mutation - and it is when one nucleotide is replaces with another nucleotide. Point mutation has several outcomes such as silence mutation, misssence mutation and nonsense mutation. Silence mutation occurs when the change in nucleotide of a codon leads to the formation of a new codon that translates into the same amino acid. Misscense mutation occurs when the codon is changed into another codon that translates into a different amino acid, and nonsense mutation occurs when the codon is changed into a codon that does not translate any amino acid. The resulting codon (the stop codon) of a nonsense mutation leads to the end of the a translation process.</w:t>
+      </w:r>
+    </w:p>
+    <w:p>
+      <w:pPr>
+        <w:pStyle w:val="BodyText"/>
+      </w:pPr>
+      <w:r>
+        <w:t xml:space="preserve">large scale mutation affects the entire structure of the chromosome. Large scale mutation involves deletion of a large region of the chromosome leading to loss of genes, and duplication of a single chromosome. Duplication can lead to extra copies of genes, and inversion is when the segment of the chromosome is reversed. Large scale mutation can occur also include insertion of an extra copy of a chromosome, and translocation of sections of the DNA from one location to another location.</w:t>
+      </w:r>
+    </w:p>
+    <w:p>
+      <w:pPr>
+        <w:pStyle w:val="BodyText"/>
+      </w:pPr>
+      <w:r>
+        <w:t xml:space="preserve">Mutation is the source of most genetic variation. Mutation can be spontaneous. This is when mutation occurs naturally in a population resulting in new phenotype or variation in the population(). spontaneous mutation naturally occurs during adaptation and evolution processes. Mutation can also be delibrately induced to occur.</w:t>
       </w:r>
     </w:p>
     <w:bookmarkEnd w:id="10"/>
-    <w:bookmarkStart w:id="11" w:name="what-is-mutation-breeding"/>
+    <w:bookmarkStart w:id="11" w:name="what-is-mutation-breeding-in-plants"/>
     <w:p>
       <w:pPr>
         <w:pStyle w:val="Heading4"/>
       </w:pPr>
       <w:r>
-        <w:t xml:space="preserve">What is mutation breeding</w:t>
+        <w:t xml:space="preserve">What is mutation breeding in plants</w:t>
       </w:r>
     </w:p>
     <w:p>
@@ -134,7 +166,7 @@
         <w:pStyle w:val="FirstParagraph"/>
       </w:pPr>
       <w:r>
-        <w:t xml:space="preserve">Mutation is the source of most genetic variation. It is occurs spontaneously and slowly in nature () Mutation breeding also called variation breeding is a method that uses physical radiation or chemicals to induce spontaneous genetic variation in plants to develop new crop varieties</w:t>
+        <w:t xml:space="preserve">Mutation breeding is a processes of creating variation in plant by intentionally inducing mutation. It involves the use of physical mutagens like ionized radiation such as x-rays, gammar rays and fast neutron. These radiations alter the DNA structure of plants. Mutation also involves the use of chemical mutagens such ethyl ethyl methanesulfonate (EMS) to induce spontaneous genetic variation in plant to develop new crop varieties</w:t>
       </w:r>
       <w:r>
         <w:t xml:space="preserve"> </w:t>
@@ -144,7 +176,7 @@
       </w:r>
     </w:p>
     <w:bookmarkEnd w:id="11"/>
-    <w:bookmarkStart w:id="20" w:name="X53bfa4b6802512ded6a17f04feab927a2cce647"/>
+    <w:bookmarkStart w:id="15" w:name="X53bfa4b6802512ded6a17f04feab927a2cce647"/>
     <w:p>
       <w:pPr>
         <w:pStyle w:val="Heading4"/>
@@ -200,8 +232,30 @@
         </w:drawing>
       </w:r>
     </w:p>
-    <w:bookmarkStart w:id="19" w:name="refs"/>
-    <w:bookmarkStart w:id="16" w:name="ref-brown2002"/>
+    <w:bookmarkEnd w:id="15"/>
+    <w:bookmarkStart w:id="21" w:name="the-process-of-mutation-breeding"/>
+    <w:p>
+      <w:pPr>
+        <w:pStyle w:val="Heading4"/>
+      </w:pPr>
+      <w:r>
+        <w:t xml:space="preserve">The process of mutation breeding</w:t>
+      </w:r>
+    </w:p>
+    <w:p>
+      <w:pPr>
+        <w:pStyle w:val="FirstParagraph"/>
+      </w:pPr>
+      <w:r>
+        <w:rPr>
+          <w:b/>
+          <w:bCs/>
+        </w:rPr>
+        <w:t xml:space="preserve">References</w:t>
+      </w:r>
+    </w:p>
+    <w:bookmarkStart w:id="20" w:name="refs"/>
+    <w:bookmarkStart w:id="17" w:name="ref-brown2002"/>
     <w:p>
       <w:pPr>
         <w:pStyle w:val="Bibliography"/>
@@ -225,7 +279,7 @@
       <w:r>
         <w:t xml:space="preserve"> </w:t>
       </w:r>
-      <w:hyperlink r:id="rId15">
+      <w:hyperlink r:id="rId16">
         <w:r>
           <w:rPr>
             <w:rStyle w:val="Hyperlink"/>
@@ -237,8 +291,8 @@
         <w:t xml:space="preserve">.</w:t>
       </w:r>
     </w:p>
-    <w:bookmarkEnd w:id="16"/>
-    <w:bookmarkStart w:id="18" w:name="ref-cvejic2026"/>
+    <w:bookmarkEnd w:id="17"/>
+    <w:bookmarkStart w:id="19" w:name="ref-cvejic2026"/>
     <w:p>
       <w:pPr>
         <w:pStyle w:val="Bibliography"/>
@@ -271,7 +325,7 @@
       <w:r>
         <w:t xml:space="preserve"> </w:t>
       </w:r>
-      <w:hyperlink r:id="rId17">
+      <w:hyperlink r:id="rId18">
         <w:r>
           <w:rPr>
             <w:rStyle w:val="Hyperlink"/>
@@ -283,10 +337,10 @@
         <w:t xml:space="preserve">.</w:t>
       </w:r>
     </w:p>
-    <w:bookmarkEnd w:id="18"/>
     <w:bookmarkEnd w:id="19"/>
     <w:bookmarkEnd w:id="20"/>
     <w:bookmarkEnd w:id="21"/>
+    <w:bookmarkEnd w:id="22"/>
     <w:sectPr>
       <w:footnotePr>
         <w:numRestart w:val="eachSect"/>

</xml_diff>

<commit_message>
I included the simple diagramatic representation of the types of mutation
</commit_message>
<xml_diff>
--- a/Mution-breeding-and-Genomic-Selection-in-Taro.docx
+++ b/Mution-breeding-and-Genomic-Selection-in-Taro.docx
@@ -15,7 +15,7 @@
         <w:pStyle w:val="Author"/>
       </w:pPr>
       <w:r>
-        <w:t xml:space="preserve">Chinedozi and Dr Onyeka</w:t>
+        <w:t xml:space="preserve">Chinedozi Amaefula and Dr Joseph Onyeka</w:t>
       </w:r>
     </w:p>
     <w:p>
@@ -23,16 +23,7 @@
         <w:pStyle w:val="Date"/>
       </w:pPr>
       <w:r>
-        <w:t xml:space="preserve">2026-09-03</w:t>
-      </w:r>
-    </w:p>
-    <w:bookmarkStart w:id="22" w:name="Xc2cce3f02a31dc3a1f22b1cace33d58e29ae6d7"/>
-    <w:p>
-      <w:pPr>
-        <w:pStyle w:val="Heading3"/>
-      </w:pPr>
-      <w:r>
-        <w:t xml:space="preserve">Understanding mutation breeding in crops or incorporating mutation breeding with genomic prediction in taro</w:t>
+        <w:t xml:space="preserve">2026-09-11</w:t>
       </w:r>
     </w:p>
     <w:p>
@@ -46,11 +37,89 @@
         </w:rPr>
         <w:t xml:space="preserve">Introduction</w:t>
       </w:r>
+    </w:p>
+    <w:p>
+      <w:pPr>
+        <w:pStyle w:val="BodyText"/>
+      </w:pPr>
+      <w:r>
+        <w:t xml:space="preserve">Taro is one of the important root crops in Nigeria and other tropical countries. It is food for – people in the world ().</w:t>
+      </w:r>
+    </w:p>
+    <w:p>
+      <w:pPr>
+        <w:pStyle w:val="BodyText"/>
+      </w:pPr>
+      <w:r>
+        <w:t xml:space="preserve">Taro is an important staple food in the world especially in the tropics and subtropics. Taro belong to the botanical family Araceae (aroid family).</w:t>
+      </w:r>
+    </w:p>
+    <w:p>
+      <w:pPr>
+        <w:pStyle w:val="BodyText"/>
+      </w:pPr>
+      <w:r>
+        <w:t xml:space="preserve">The world production of the crop for 2023 to 2024 () with Nigeria being the top producer of the crop ().</w:t>
+      </w:r>
+    </w:p>
+    <w:p>
+      <w:pPr>
+        <w:pStyle w:val="BodyText"/>
+      </w:pPr>
+      <w:r>
+        <w:t xml:space="preserve">All parts of the taro are useful as food for both humans and animal. The young leaves are edible and so are the corms and cormels. Growing conditions of taro</w:t>
+      </w:r>
+    </w:p>
+    <w:bookmarkStart w:id="9" w:name="the-botany-of-taro"/>
+    <w:p>
+      <w:pPr>
+        <w:pStyle w:val="Heading4"/>
+      </w:pPr>
+      <w:r>
+        <w:t xml:space="preserve">The botany of Taro</w:t>
+      </w:r>
+    </w:p>
+    <w:p>
+      <w:pPr>
+        <w:pStyle w:val="FirstParagraph"/>
+      </w:pPr>
+      <w:r>
+        <w:t xml:space="preserve">Taro is usually cultivated vegetatively using the corms and the cormels this is because of the firstly most taro varieties do not flower and or have produce poor seeds and secondly the onset of disease intercepts the time of flower maturation leading to the death of most of the plant hence lack of seeds available for the next planting season. this is a major bottle neck of tara improvement.</w:t>
+      </w:r>
+    </w:p>
+    <w:p>
+      <w:pPr>
+        <w:pStyle w:val="BodyText"/>
+      </w:pPr>
+      <w:r>
+        <w:t xml:space="preserve">Taro breeders are seeking for ways to overcome the problem of seed availability and have employed method such as staggering the planting time to escape disease the peak of disease outbreak. Mutation breeding is one method that breeders can employ to increase genetic diversity of taro. there is need to understand what mutation is before we think of mutation breeding</w:t>
+      </w:r>
+    </w:p>
+    <w:bookmarkEnd w:id="9"/>
+    <w:bookmarkStart w:id="13" w:name="what-is-mutation"/>
+    <w:p>
+      <w:pPr>
+        <w:pStyle w:val="Heading4"/>
+      </w:pPr>
+      <w:r>
+        <w:t xml:space="preserve">What is Mutation</w:t>
+      </w:r>
+    </w:p>
+    <w:p>
+      <w:pPr>
+        <w:pStyle w:val="FirstParagraph"/>
+      </w:pPr>
+      <w:r>
+        <w:t xml:space="preserve">Mutation is a change in the nucleotide sequence of a short region of a genome. Mutation occurs either due to error in the DNA replication or from the effect of mutagens such as chemicals, heat and irradiation leading to structural changes n the DNA. The change usually affect on one strand of the parent double helix. that is only one strand carries the mutation</w:t>
+      </w:r>
       <w:r>
         <w:t xml:space="preserve"> </w:t>
       </w:r>
       <w:r>
-        <w:t xml:space="preserve">Taro is one of the important root crops in Nigeria and other tropical countries. It is food for – people in the world ().</w:t>
+        <w:t xml:space="preserve">(Brown 2002)</w:t>
+      </w:r>
+      <w:r>
+        <w:t xml:space="preserve">.</w:t>
       </w:r>
     </w:p>
     <w:p>
@@ -58,7 +127,7 @@
         <w:pStyle w:val="BodyText"/>
       </w:pPr>
       <w:r>
-        <w:t xml:space="preserve">Taro is an important staple food in the world especially in the tropics and subtropics. Taro belong to the botanical family Araceae (aroid family).</w:t>
+        <w:t xml:space="preserve">Mutation can be classified based on the scale of the DNA sequence affected by the mutational events. mutaion can be either small or large scale.</w:t>
       </w:r>
     </w:p>
     <w:p>
@@ -66,7 +135,7 @@
         <w:pStyle w:val="BodyText"/>
       </w:pPr>
       <w:r>
-        <w:t xml:space="preserve">The world production of the crop for 2023 to 2024 () with Nigeria being the top producer of the crop ().</w:t>
+        <w:t xml:space="preserve">Small scale mutation involves changes in one or few nucleotides. Small scale mutation includes deletion, insertion and substitution of one or few nucleotides. Substitution is also called point mutation - and it is when one nucleotide is replaces with another nucleotide. Point mutation occurs in two way; transition - when a purine is converted to a purine and vice versa. Transversion is when a purine is converted to a pyrimidine and vice versa. Point mutation is of three types, silence mutation, missence mutation and nonsense mutation. Silence mutation occurs when the change in nucleotide of a codon leads to the formation of a new codon that translates into the same amino acid. Mis-sense mutation occurs when the codon is changed into another codon that translates into a different amino acid, and non-sense mutation occurs when the codon is changed into a codon that does not translate any amino acid. The resulting codon (the stop codon) of a non-sense mutation leads to the end of the a translation process.</w:t>
       </w:r>
     </w:p>
     <w:p>
@@ -74,138 +143,183 @@
         <w:pStyle w:val="BodyText"/>
       </w:pPr>
       <w:r>
-        <w:t xml:space="preserve">All parts of the taro are useful as food for both humans and animal. The young leaves are edible and so are the corms and cormels. Growing conditions of taro</w:t>
-      </w:r>
-    </w:p>
-    <w:bookmarkStart w:id="9" w:name="the-botany-of-taro"/>
-    <w:p>
-      <w:pPr>
-        <w:pStyle w:val="Heading4"/>
-      </w:pPr>
-      <w:r>
-        <w:t xml:space="preserve">The botany of Taro</w:t>
-      </w:r>
-    </w:p>
-    <w:p>
-      <w:pPr>
-        <w:pStyle w:val="FirstParagraph"/>
-      </w:pPr>
-      <w:r>
-        <w:t xml:space="preserve">Taro is usually cultivated vegetatively using the corms and the cormels this is because of the firstly most taro varieties do not flower and or have produce poor seeds and secondly the onset of disease intercepts the time of flower maturation leading to the death of most of the plant hence lack of seeds available for the next planting season. this is a major bottle neck of tara improvement.</w:t>
+        <w:t xml:space="preserve">Large scale mutation affects the entire structure of the chromosome. Large scale mutation involves deletion of a large region of the chromosome leading to loss of genes, and duplication of a single chromosome. Duplication can lead to extra copies of genes, and inversion is when the segment of the chromosome is reversed. Large scale mutation can occur also include insertion of an extra copy of a chromosome, and translocation of sections of the DNA from one location to another location.</w:t>
       </w:r>
     </w:p>
     <w:p>
       <w:pPr>
         <w:pStyle w:val="BodyText"/>
-      </w:pPr>
-      <w:r>
-        <w:t xml:space="preserve">Taro breeders are seeking for ways to overcome the problem of seed availability and have employed method such as staggering the planting time to escape disease the peak of disease outbreak. Mutation breeding is one method that breeders can employ to increase genetic diversity of taro. there is need to understand what mutation is before we think of mutation breeding</w:t>
-      </w:r>
-    </w:p>
-    <w:bookmarkEnd w:id="9"/>
-    <w:bookmarkStart w:id="10" w:name="what-is-mutation"/>
-    <w:p>
-      <w:pPr>
-        <w:pStyle w:val="Heading4"/>
-      </w:pPr>
-      <w:r>
-        <w:t xml:space="preserve">What is Mutation</w:t>
-      </w:r>
-    </w:p>
-    <w:p>
-      <w:pPr>
-        <w:pStyle w:val="FirstParagraph"/>
-      </w:pPr>
-      <w:r>
-        <w:t xml:space="preserve">Mutation is a change in the nucleotide sequence of a short region of a genome. Mutation occurs either due to error in the DNA replication or from the effect of mutagens such as chemicals, heat and irradiation leading to structural changes n the DNA. The change usually affect on one strand of the parent double helix. that is only one strand carries the mutation</w:t>
-      </w:r>
-      <w:r>
-        <w:t xml:space="preserve"> </w:t>
-      </w:r>
-      <w:r>
-        <w:t xml:space="preserve">(Brown 2002)</w:t>
-      </w:r>
-      <w:r>
-        <w:t xml:space="preserve">. Mutation occur in small or large scale.</w:t>
-      </w:r>
-      <w:r>
-        <w:t xml:space="preserve"> </w:t>
-      </w:r>
-      <w:r>
-        <w:t xml:space="preserve">Small scale mutation involves changes in one or few nucleotide. Small scale mutation includes deletion, insertion and substitution of one or few nucleotide. Substitution is also called point mutation - and it is when one nucleotide is replaces with another nucleotide. Point mutation has several outcomes such as silence mutation, misssence mutation and nonsense mutation. Silence mutation occurs when the change in nucleotide of a codon leads to the formation of a new codon that translates into the same amino acid. Misscense mutation occurs when the codon is changed into another codon that translates into a different amino acid, and nonsense mutation occurs when the codon is changed into a codon that does not translate any amino acid. The resulting codon (the stop codon) of a nonsense mutation leads to the end of the a translation process.</w:t>
-      </w:r>
-    </w:p>
-    <w:p>
-      <w:pPr>
-        <w:pStyle w:val="BodyText"/>
-      </w:pPr>
-      <w:r>
-        <w:t xml:space="preserve">large scale mutation affects the entire structure of the chromosome. Large scale mutation involves deletion of a large region of the chromosome leading to loss of genes, and duplication of a single chromosome. Duplication can lead to extra copies of genes, and inversion is when the segment of the chromosome is reversed. Large scale mutation can occur also include insertion of an extra copy of a chromosome, and translocation of sections of the DNA from one location to another location.</w:t>
-      </w:r>
-    </w:p>
-    <w:p>
-      <w:pPr>
-        <w:pStyle w:val="BodyText"/>
-      </w:pPr>
-      <w:r>
-        <w:t xml:space="preserve">Mutation is the source of most genetic variation. Mutation can be spontaneous. This is when mutation occurs naturally in a population resulting in new phenotype or variation in the population(). spontaneous mutation naturally occurs during adaptation and evolution processes. Mutation can also be delibrately induced to occur.</w:t>
-      </w:r>
-    </w:p>
-    <w:bookmarkEnd w:id="10"/>
-    <w:bookmarkStart w:id="11" w:name="what-is-mutation-breeding-in-plants"/>
-    <w:p>
-      <w:pPr>
-        <w:pStyle w:val="Heading4"/>
-      </w:pPr>
-      <w:r>
-        <w:t xml:space="preserve">What is mutation breeding in plants</w:t>
-      </w:r>
-    </w:p>
-    <w:p>
-      <w:pPr>
-        <w:pStyle w:val="FirstParagraph"/>
-      </w:pPr>
-      <w:r>
-        <w:t xml:space="preserve">Mutation breeding is a processes of creating variation in plant by intentionally inducing mutation. It involves the use of physical mutagens like ionized radiation such as x-rays, gammar rays and fast neutron. These radiations alter the DNA structure of plants. Mutation also involves the use of chemical mutagens such ethyl ethyl methanesulfonate (EMS) to induce spontaneous genetic variation in plant to develop new crop varieties</w:t>
-      </w:r>
-      <w:r>
-        <w:t xml:space="preserve"> </w:t>
-      </w:r>
-      <w:r>
-        <w:t xml:space="preserve">(Cvejić et al. 2026)</w:t>
-      </w:r>
-    </w:p>
-    <w:bookmarkEnd w:id="11"/>
-    <w:bookmarkStart w:id="15" w:name="X53bfa4b6802512ded6a17f04feab927a2cce647"/>
-    <w:p>
-      <w:pPr>
-        <w:pStyle w:val="Heading4"/>
-      </w:pPr>
-      <w:r>
-        <w:t xml:space="preserve">Genomic selection and mutation breeding workflow</w:t>
-      </w:r>
-    </w:p>
-    <w:p>
-      <w:pPr>
-        <w:pStyle w:val="FirstParagraph"/>
       </w:pPr>
       <w:r>
         <w:drawing>
           <wp:inline>
-            <wp:extent cx="5334000" cy="5676148"/>
+            <wp:extent cx="5334000" cy="3219730"/>
             <wp:effectExtent b="0" l="0" r="0" t="0"/>
-            <wp:docPr descr="" title="" id="13" name="Picture"/>
+            <wp:docPr descr="" title="" id="11" name="Picture"/>
             <a:graphic>
               <a:graphicData uri="http://schemas.openxmlformats.org/drawingml/2006/picture">
                 <pic:pic>
                   <pic:nvPicPr>
-                    <pic:cNvPr descr="Mution-breeding-and-Genomic-Selection-in-Taro_files/images/mutation breeding 2-01.png" id="14" name="Picture"/>
+                    <pic:cNvPr descr="Mution-breeding-and-Genomic-Selection-in-Taro_files/images/clipboard-3780650227.png" id="12" name="Picture"/>
                     <pic:cNvPicPr>
                       <a:picLocks noChangeArrowheads="1" noChangeAspect="1"/>
                     </pic:cNvPicPr>
                   </pic:nvPicPr>
                   <pic:blipFill>
-                    <a:blip r:embed="rId12"/>
+                    <a:blip r:embed="rId10"/>
+                    <a:stretch>
+                      <a:fillRect/>
+                    </a:stretch>
+                  </pic:blipFill>
+                  <pic:spPr bwMode="auto">
+                    <a:xfrm>
+                      <a:off x="0" y="0"/>
+                      <a:ext cx="5334000" cy="3219730"/>
+                    </a:xfrm>
+                    <a:prstGeom prst="rect">
+                      <a:avLst/>
+                    </a:prstGeom>
+                    <a:noFill/>
+                    <a:ln w="9525">
+                      <a:noFill/>
+                      <a:headEnd/>
+                      <a:tailEnd/>
+                    </a:ln>
+                  </pic:spPr>
+                </pic:pic>
+              </a:graphicData>
+            </a:graphic>
+          </wp:inline>
+        </w:drawing>
+      </w:r>
+    </w:p>
+    <w:p>
+      <w:pPr>
+        <w:pStyle w:val="BodyText"/>
+      </w:pPr>
+      <w:r>
+        <w:t xml:space="preserve">fig 1: Types of mutation</w:t>
+      </w:r>
+    </w:p>
+    <w:p>
+      <w:pPr>
+        <w:pStyle w:val="BodyText"/>
+      </w:pPr>
+      <w:r>
+        <w:t xml:space="preserve">Mutation is the source of most genetic variation. Mutation can be spontaneous. This is when mutation occurs naturally in a population resulting in new phenotype or variation in the population(). spontaneous mutation naturally occurs during adaptation and evolution processes. Mutation can also be delibrately induced to occur.</w:t>
+      </w:r>
+    </w:p>
+    <w:p>
+      <w:pPr>
+        <w:pStyle w:val="BodyText"/>
+      </w:pPr>
+      <w:r>
+        <w:t xml:space="preserve">mutati</w:t>
+      </w:r>
+    </w:p>
+    <w:bookmarkEnd w:id="13"/>
+    <w:bookmarkStart w:id="14" w:name="mutation-breeding-for-crop-improvement"/>
+    <w:p>
+      <w:pPr>
+        <w:pStyle w:val="Heading4"/>
+      </w:pPr>
+      <w:r>
+        <w:t xml:space="preserve">Mutation breeding for crop improvement</w:t>
+      </w:r>
+    </w:p>
+    <w:p>
+      <w:pPr>
+        <w:pStyle w:val="FirstParagraph"/>
+      </w:pPr>
+      <w:r>
+        <w:t xml:space="preserve">Crop improvements can be made when sufficent variation for a given trait of interest is available within the gene pool of the crop. In many cases, the desired variation may exist in out-dated varieties, old landraces (Forstera and Shu 2011). to harness these desired variations from the elite varieties or landraces into the new lines will involve long breeding process which might be less appealing to the plant breeder. A much better approach is to cause variation in the new lines without undergoing so several crosses and selection. Mutation breeding is one method that can create variation without involving crossing.</w:t>
+      </w:r>
+    </w:p>
+    <w:p>
+      <w:pPr>
+        <w:pStyle w:val="BodyText"/>
+      </w:pPr>
+      <w:r>
+        <w:t xml:space="preserve">Freisleben and Lein (1944) first defined the term mutation breeding as the deliberate induction and development of mutant lines for crop improvement (Forstera and Shu 2011). Mutation breeding is a processes of creating variation in plant by intentionally inducing mutations and utilize them for crop improvement.</w:t>
+      </w:r>
+    </w:p>
+    <w:p>
+      <w:pPr>
+        <w:pStyle w:val="BodyText"/>
+      </w:pPr>
+      <w:r>
+        <w:t xml:space="preserve">It involves the use of physical mutagens like ionized radiation such as x-rays, gammar rays and fast neutron. These radiations alter the DNA structure of plants. Mutation also involves the use of chemical mutagens such ethyl ethyl methanesulfonate (EMS) to induce spontaneous genetic variation in plant to develop new crop varieties</w:t>
+      </w:r>
+      <w:r>
+        <w:t xml:space="preserve"> </w:t>
+      </w:r>
+      <w:r>
+        <w:t xml:space="preserve">(Cvejić et al. 2026)</w:t>
+      </w:r>
+      <w:r>
+        <w:t xml:space="preserve"> </w:t>
+      </w:r>
+      <w:r>
+        <w:t xml:space="preserve">one of the advantages of mutation breeding is that it increases the genetic diversity. Genetic diversity is important to plant breeders because it allows for the selection of new traits. Although mutants can be produced using different mutagens, mutation breeding is restricted to the use of physical and chemical mutagens (Forstera and Shu 2011).</w:t>
+      </w:r>
+    </w:p>
+    <w:p>
+      <w:pPr>
+        <w:pStyle w:val="BodyText"/>
+      </w:pPr>
+      <w:r>
+        <w:t xml:space="preserve">Mutation breeding can be useful in plants with narrow genetic base like taro.</w:t>
+      </w:r>
+    </w:p>
+    <w:bookmarkEnd w:id="14"/>
+    <w:bookmarkStart w:id="15" w:name="Xfb671e7d8b340cf9eca7793602245abea5c68ee"/>
+    <w:p>
+      <w:pPr>
+        <w:pStyle w:val="Heading4"/>
+      </w:pPr>
+      <w:r>
+        <w:t xml:space="preserve">Principles and application of mutation breeding</w:t>
+      </w:r>
+    </w:p>
+    <w:p>
+      <w:pPr>
+        <w:pStyle w:val="FirstParagraph"/>
+      </w:pPr>
+      <w:r>
+        <w:t xml:space="preserve">induce mutation wethere due to physical or chemical mutagens occur at random across the gemone or within any locus or gene ()</w:t>
+      </w:r>
+    </w:p>
+    <w:bookmarkEnd w:id="15"/>
+    <w:bookmarkStart w:id="24" w:name="X53bfa4b6802512ded6a17f04feab927a2cce647"/>
+    <w:p>
+      <w:pPr>
+        <w:pStyle w:val="Heading4"/>
+      </w:pPr>
+      <w:r>
+        <w:t xml:space="preserve">Genomic selection and mutation breeding workflow</w:t>
+      </w:r>
+    </w:p>
+    <w:p>
+      <w:pPr>
+        <w:pStyle w:val="FirstParagraph"/>
+      </w:pPr>
+      <w:r>
+        <w:drawing>
+          <wp:inline>
+            <wp:extent cx="5334000" cy="5676148"/>
+            <wp:effectExtent b="0" l="0" r="0" t="0"/>
+            <wp:docPr descr="" title="" id="17" name="Picture"/>
+            <a:graphic>
+              <a:graphicData uri="http://schemas.openxmlformats.org/drawingml/2006/picture">
+                <pic:pic>
+                  <pic:nvPicPr>
+                    <pic:cNvPr descr="Mution-breeding-and-Genomic-Selection-in-Taro_files/images/mutation breeding 2-01.png" id="18" name="Picture"/>
+                    <pic:cNvPicPr>
+                      <a:picLocks noChangeArrowheads="1" noChangeAspect="1"/>
+                    </pic:cNvPicPr>
+                  </pic:nvPicPr>
+                  <pic:blipFill>
+                    <a:blip r:embed="rId16"/>
                     <a:stretch>
                       <a:fillRect/>
                     </a:stretch>
@@ -232,19 +346,9 @@
         </w:drawing>
       </w:r>
     </w:p>
-    <w:bookmarkEnd w:id="15"/>
-    <w:bookmarkStart w:id="21" w:name="the-process-of-mutation-breeding"/>
-    <w:p>
-      <w:pPr>
-        <w:pStyle w:val="Heading4"/>
-      </w:pPr>
-      <w:r>
-        <w:t xml:space="preserve">The process of mutation breeding</w:t>
-      </w:r>
-    </w:p>
-    <w:p>
-      <w:pPr>
-        <w:pStyle w:val="FirstParagraph"/>
+    <w:p>
+      <w:pPr>
+        <w:pStyle w:val="BodyText"/>
       </w:pPr>
       <w:r>
         <w:rPr>
@@ -254,8 +358,24 @@
         <w:t xml:space="preserve">References</w:t>
       </w:r>
     </w:p>
-    <w:bookmarkStart w:id="20" w:name="refs"/>
-    <w:bookmarkStart w:id="17" w:name="ref-brown2002"/>
+    <w:p>
+      <w:pPr>
+        <w:pStyle w:val="BodyText"/>
+      </w:pPr>
+      <w:r>
+        <w:t xml:space="preserve">Freisleben, R.A. and Lein, A. 1944. Möglichkeiten und praktische Durchführung der Mutationszüchtung. Kühn-Arhiv. 60: 211-22.</w:t>
+      </w:r>
+    </w:p>
+    <w:p>
+      <w:pPr>
+        <w:pStyle w:val="BodyText"/>
+      </w:pPr>
+      <w:r>
+        <w:t xml:space="preserve">Forstera B.P. and Shu Q.Y. 2011 Plant Mutagenesis in Crop Improvement: Basic Terms and Applications in Shu Q.Y. , Forster B.P., and Nakagawa H. edited Plant Mutation Breeding and Biotechnology. Plant Breeding and Genetics Section Joint FAO/IAEA Division of Nuclear Techniques in Food and Agriculture International Atomic Energy Agency, Vienna, Austria</w:t>
+      </w:r>
+    </w:p>
+    <w:bookmarkStart w:id="23" w:name="refs"/>
+    <w:bookmarkStart w:id="20" w:name="ref-brown2002"/>
     <w:p>
       <w:pPr>
         <w:pStyle w:val="Bibliography"/>
@@ -279,7 +399,7 @@
       <w:r>
         <w:t xml:space="preserve"> </w:t>
       </w:r>
-      <w:hyperlink r:id="rId16">
+      <w:hyperlink r:id="rId19">
         <w:r>
           <w:rPr>
             <w:rStyle w:val="Hyperlink"/>
@@ -291,8 +411,8 @@
         <w:t xml:space="preserve">.</w:t>
       </w:r>
     </w:p>
-    <w:bookmarkEnd w:id="17"/>
-    <w:bookmarkStart w:id="19" w:name="ref-cvejic2026"/>
+    <w:bookmarkEnd w:id="20"/>
+    <w:bookmarkStart w:id="22" w:name="ref-cvejic2026"/>
     <w:p>
       <w:pPr>
         <w:pStyle w:val="Bibliography"/>
@@ -325,7 +445,7 @@
       <w:r>
         <w:t xml:space="preserve"> </w:t>
       </w:r>
-      <w:hyperlink r:id="rId18">
+      <w:hyperlink r:id="rId21">
         <w:r>
           <w:rPr>
             <w:rStyle w:val="Hyperlink"/>
@@ -337,10 +457,9 @@
         <w:t xml:space="preserve">.</w:t>
       </w:r>
     </w:p>
-    <w:bookmarkEnd w:id="19"/>
-    <w:bookmarkEnd w:id="20"/>
-    <w:bookmarkEnd w:id="21"/>
     <w:bookmarkEnd w:id="22"/>
+    <w:bookmarkEnd w:id="23"/>
+    <w:bookmarkEnd w:id="24"/>
     <w:sectPr>
       <w:footnotePr>
         <w:numRestart w:val="eachSect"/>

</xml_diff>

<commit_message>
I included a new section called mutagens.
</commit_message>
<xml_diff>
--- a/Mution-breeding-and-Genomic-Selection-in-Taro.docx
+++ b/Mution-breeding-and-Genomic-Selection-in-Taro.docx
@@ -23,7 +23,7 @@
         <w:pStyle w:val="Date"/>
       </w:pPr>
       <w:r>
-        <w:t xml:space="preserve">2026-09-11</w:t>
+        <w:t xml:space="preserve">2026-09-14</w:t>
       </w:r>
     </w:p>
     <w:p>
@@ -153,7 +153,7 @@
       <w:r>
         <w:drawing>
           <wp:inline>
-            <wp:extent cx="5334000" cy="3219730"/>
+            <wp:extent cx="5943600" cy="3587699"/>
             <wp:effectExtent b="0" l="0" r="0" t="0"/>
             <wp:docPr descr="" title="" id="11" name="Picture"/>
             <a:graphic>
@@ -174,7 +174,7 @@
                   <pic:spPr bwMode="auto">
                     <a:xfrm>
                       <a:off x="0" y="0"/>
-                      <a:ext cx="5334000" cy="3219730"/>
+                      <a:ext cx="5943600" cy="3587699"/>
                     </a:xfrm>
                     <a:prstGeom prst="rect">
                       <a:avLst/>
@@ -206,7 +206,66 @@
         <w:pStyle w:val="BodyText"/>
       </w:pPr>
       <w:r>
-        <w:t xml:space="preserve">Mutation is the source of most genetic variation. Mutation can be spontaneous. This is when mutation occurs naturally in a population resulting in new phenotype or variation in the population(). spontaneous mutation naturally occurs during adaptation and evolution processes. Mutation can also be delibrately induced to occur.</w:t>
+        <w:t xml:space="preserve">Mutation is the main source of all genetic variation that occurs in organisms including plants (Kharkwal 2011). these variation are the source of raw materials needed for natural selection to operate and ring about evolution (Kharkwal 2011)</w:t>
+      </w:r>
+      <w:r>
+        <w:t xml:space="preserve"> </w:t>
+      </w:r>
+      <w:r>
+        <w:t xml:space="preserve">Mutation can be spontaneous. This is when mutation occurs naturally in a population resulting in new phenotype or variation in the population(). spontaneous mutation naturally occurs during adaptation and evolution processes. Mutation can also be deliberately induced to occur.</w:t>
+      </w:r>
+    </w:p>
+    <w:bookmarkEnd w:id="13"/>
+    <w:bookmarkStart w:id="25" w:name="mutagens"/>
+    <w:p>
+      <w:pPr>
+        <w:pStyle w:val="Heading3"/>
+      </w:pPr>
+      <w:r>
+        <w:t xml:space="preserve">Mutagens</w:t>
+      </w:r>
+    </w:p>
+    <w:p>
+      <w:pPr>
+        <w:pStyle w:val="FirstParagraph"/>
+      </w:pPr>
+      <w:r>
+        <w:t xml:space="preserve">Mutation involves the use of physical mutagens like ionized radiation such as x-rays, gammar rays and fast neutron. These radiations alter the DNA structure of plants. Mutation also involves the use of chemical mutagens such ethyl ethyl methanesulfonate (EMS) to induce spontaneous genetic variation in plant to develop new crop varieties</w:t>
+      </w:r>
+      <w:r>
+        <w:t xml:space="preserve"> </w:t>
+      </w:r>
+      <w:r>
+        <w:t xml:space="preserve">(Cvejić et al. 2026)</w:t>
+      </w:r>
+      <w:r>
+        <w:t xml:space="preserve"> </w:t>
+      </w:r>
+      <w:r>
+        <w:t xml:space="preserve">one of the advantages of mutation breeding is that it increases the genetic diversity.</w:t>
+      </w:r>
+      <w:r>
+        <w:t xml:space="preserve"> </w:t>
+      </w:r>
+      <w:r>
+        <w:t xml:space="preserve">Mutation can also be induced using biotechnological processes (Kharkwal 2011)</w:t>
+      </w:r>
+    </w:p>
+    <w:bookmarkStart w:id="14" w:name="mutation-breeding-for-crop-improvement"/>
+    <w:p>
+      <w:pPr>
+        <w:pStyle w:val="Heading4"/>
+      </w:pPr>
+      <w:r>
+        <w:t xml:space="preserve">Mutation breeding for crop improvement</w:t>
+      </w:r>
+    </w:p>
+    <w:p>
+      <w:pPr>
+        <w:pStyle w:val="FirstParagraph"/>
+      </w:pPr>
+      <w:r>
+        <w:t xml:space="preserve">Crop improvements can be made when sufficient variation for a given trait of interest is available within the gene pool of the crop. In many cases, the desired variation may exist in out-dated varieties, old landraces (Forstera and Shu 2011). to harness these desired variations from the elite varieties or landraces into the new lines will involve long breeding process which might be less appealing to the plant breeder. A much better approach is to cause variation in the new lines without undergoing so several crosses and selection. Mutation breeding is one method that can create variation without involving crossing.</w:t>
       </w:r>
     </w:p>
     <w:p>
@@ -214,25 +273,7 @@
         <w:pStyle w:val="BodyText"/>
       </w:pPr>
       <w:r>
-        <w:t xml:space="preserve">mutati</w:t>
-      </w:r>
-    </w:p>
-    <w:bookmarkEnd w:id="13"/>
-    <w:bookmarkStart w:id="14" w:name="mutation-breeding-for-crop-improvement"/>
-    <w:p>
-      <w:pPr>
-        <w:pStyle w:val="Heading4"/>
-      </w:pPr>
-      <w:r>
-        <w:t xml:space="preserve">Mutation breeding for crop improvement</w:t>
-      </w:r>
-    </w:p>
-    <w:p>
-      <w:pPr>
-        <w:pStyle w:val="FirstParagraph"/>
-      </w:pPr>
-      <w:r>
-        <w:t xml:space="preserve">Crop improvements can be made when sufficent variation for a given trait of interest is available within the gene pool of the crop. In many cases, the desired variation may exist in out-dated varieties, old landraces (Forstera and Shu 2011). to harness these desired variations from the elite varieties or landraces into the new lines will involve long breeding process which might be less appealing to the plant breeder. A much better approach is to cause variation in the new lines without undergoing so several crosses and selection. Mutation breeding is one method that can create variation without involving crossing.</w:t>
+        <w:t xml:space="preserve">Freisleben and Lein (1944) first defined the term mutation breeding as the deliberate induction and development of mutant lines for crop improvement (Forstera and Shu 2011). Mutation breeding is a processes of creating variation in plant by intentionally inducing mutations and utilize them for crop improvement.</w:t>
       </w:r>
     </w:p>
     <w:p>
@@ -240,27 +281,7 @@
         <w:pStyle w:val="BodyText"/>
       </w:pPr>
       <w:r>
-        <w:t xml:space="preserve">Freisleben and Lein (1944) first defined the term mutation breeding as the deliberate induction and development of mutant lines for crop improvement (Forstera and Shu 2011). Mutation breeding is a processes of creating variation in plant by intentionally inducing mutations and utilize them for crop improvement.</w:t>
-      </w:r>
-    </w:p>
-    <w:p>
-      <w:pPr>
-        <w:pStyle w:val="BodyText"/>
-      </w:pPr>
-      <w:r>
-        <w:t xml:space="preserve">It involves the use of physical mutagens like ionized radiation such as x-rays, gammar rays and fast neutron. These radiations alter the DNA structure of plants. Mutation also involves the use of chemical mutagens such ethyl ethyl methanesulfonate (EMS) to induce spontaneous genetic variation in plant to develop new crop varieties</w:t>
-      </w:r>
-      <w:r>
-        <w:t xml:space="preserve"> </w:t>
-      </w:r>
-      <w:r>
-        <w:t xml:space="preserve">(Cvejić et al. 2026)</w:t>
-      </w:r>
-      <w:r>
-        <w:t xml:space="preserve"> </w:t>
-      </w:r>
-      <w:r>
-        <w:t xml:space="preserve">one of the advantages of mutation breeding is that it increases the genetic diversity. Genetic diversity is important to plant breeders because it allows for the selection of new traits. Although mutants can be produced using different mutagens, mutation breeding is restricted to the use of physical and chemical mutagens (Forstera and Shu 2011).</w:t>
+        <w:t xml:space="preserve">Genetic diversity is important to plant breeders because it allows for the selection of new traits. Although mutants can be produced using different mutagens, mutation breeding is restricted to the use of physical and chemical mutagens (Forstera and Shu 2011).</w:t>
       </w:r>
     </w:p>
     <w:p>
@@ -286,7 +307,7 @@
         <w:pStyle w:val="FirstParagraph"/>
       </w:pPr>
       <w:r>
-        <w:t xml:space="preserve">induce mutation wethere due to physical or chemical mutagens occur at random across the gemone or within any locus or gene ()</w:t>
+        <w:t xml:space="preserve">Induce mutation caused either due to physical or chemical mutagens occur at random across the genome or within any locus or gene ()</w:t>
       </w:r>
     </w:p>
     <w:bookmarkEnd w:id="15"/>
@@ -306,7 +327,7 @@
       <w:r>
         <w:drawing>
           <wp:inline>
-            <wp:extent cx="5334000" cy="5676148"/>
+            <wp:extent cx="5943600" cy="6324850"/>
             <wp:effectExtent b="0" l="0" r="0" t="0"/>
             <wp:docPr descr="" title="" id="17" name="Picture"/>
             <a:graphic>
@@ -327,7 +348,7 @@
                   <pic:spPr bwMode="auto">
                     <a:xfrm>
                       <a:off x="0" y="0"/>
-                      <a:ext cx="5334000" cy="5676148"/>
+                      <a:ext cx="5943600" cy="6324850"/>
                     </a:xfrm>
                     <a:prstGeom prst="rect">
                       <a:avLst/>
@@ -371,7 +392,15 @@
         <w:pStyle w:val="BodyText"/>
       </w:pPr>
       <w:r>
-        <w:t xml:space="preserve">Forstera B.P. and Shu Q.Y. 2011 Plant Mutagenesis in Crop Improvement: Basic Terms and Applications in Shu Q.Y. , Forster B.P., and Nakagawa H. edited Plant Mutation Breeding and Biotechnology. Plant Breeding and Genetics Section Joint FAO/IAEA Division of Nuclear Techniques in Food and Agriculture International Atomic Energy Agency, Vienna, Austria</w:t>
+        <w:t xml:space="preserve">Forstera B.P. and Shu Q.Y. 2011 Plant Mutagenesis in Crop Improvement: Basic Terms and Applications in Shu Q.Y., Forster B.P., and Nakagawa H. edited Plant Mutation Breeding and Biotechnology. Plant Breeding and Genetics Section Joint FAO/IAEA Division of Nuclear Techniques in Food and Agriculture International Atomic Energy Agency, Vienna, Austria</w:t>
+      </w:r>
+    </w:p>
+    <w:p>
+      <w:pPr>
+        <w:pStyle w:val="BodyText"/>
+      </w:pPr>
+      <w:r>
+        <w:t xml:space="preserve">Kharkwal M.C. 2011 A Brief History of Plant Mutagenesis in Shu Q.Y., Forster B.P., and Nakagawa H. edited Plant Mutation Breeding and Biotechnology. Plant Breeding and Genetics Section Joint FAO/IAEA Division of Nuclear Techniques in Food and Agriculture International Atomic Energy Agency, Vienna, Austria</w:t>
       </w:r>
     </w:p>
     <w:bookmarkStart w:id="23" w:name="refs"/>
@@ -460,10 +489,12 @@
     <w:bookmarkEnd w:id="22"/>
     <w:bookmarkEnd w:id="23"/>
     <w:bookmarkEnd w:id="24"/>
+    <w:bookmarkEnd w:id="25"/>
     <w:sectPr>
-      <w:footnotePr>
-        <w:numRestart w:val="eachSect"/>
-      </w:footnotePr>
+      <w:pgSz w:h="15840" w:w="12240"/>
+      <w:pgMar w:bottom="1440" w:footer="720" w:gutter="0" w:header="720" w:left="1440" w:right="1440" w:top="1440"/>
+      <w:cols w:space="720"/>
+      <w:docGrid w:linePitch="360"/>
     </w:sectPr>
   </w:body>
 </w:document>
@@ -577,191 +608,414 @@
 </file>
 
 <file path=word/styles.xml><?xml version="1.0" encoding="utf-8"?>
-<w:styles xmlns:r="http://schemas.openxmlformats.org/officeDocument/2006/relationships" xmlns:w="http://schemas.openxmlformats.org/wordprocessingml/2006/main">
+<w:styles xmlns:mc="http://schemas.openxmlformats.org/markup-compatibility/2006" xmlns:r="http://schemas.openxmlformats.org/officeDocument/2006/relationships" xmlns:w="http://schemas.openxmlformats.org/wordprocessingml/2006/main" xmlns:w14="http://schemas.microsoft.com/office/word/2010/wordml" xmlns:w15="http://schemas.microsoft.com/office/word/2012/wordml" xmlns:w16="http://schemas.microsoft.com/office/word/2018/wordml" xmlns:w16cex="http://schemas.microsoft.com/office/word/2018/wordml/cex" xmlns:w16cid="http://schemas.microsoft.com/office/word/2016/wordml/cid" xmlns:w16du="http://schemas.microsoft.com/office/word/2023/wordml/word16du" xmlns:w16sdtdh="http://schemas.microsoft.com/office/word/2020/wordml/sdtdatahash" xmlns:w16sdtfl="http://schemas.microsoft.com/office/word/2024/wordml/sdtformatlock" xmlns:w16se="http://schemas.microsoft.com/office/word/2015/wordml/symex" mc:Ignorable="w14 w15 w16se w16cid w16 w16cex w16sdtdh w16sdtfl w16du">
   <w:docDefaults>
     <w:rPrDefault>
       <w:rPr>
-        <w:rFonts w:asciiTheme="minorHAnsi" w:cstheme="minorBidi" w:eastAsiaTheme="minorEastAsia" w:hAnsiTheme="minorHAnsi"/>
+        <w:rFonts w:asciiTheme="minorHAnsi" w:cstheme="minorBidi" w:eastAsiaTheme="minorHAnsi" w:hAnsiTheme="minorHAnsi"/>
+        <w:kern w:val="2"/>
         <w:sz w:val="24"/>
         <w:szCs w:val="24"/>
-        <w:lang w:bidi="ar-SA" w:eastAsia="zh-CN" w:val="en-US"/>
+        <w:lang w:bidi="ar-SA" w:eastAsia="en-US" w:val="en-US"/>
+        <w14:ligatures w14:val="standardContextual"/>
       </w:rPr>
     </w:rPrDefault>
     <w:pPrDefault>
       <w:pPr>
-        <w:spacing w:after="200"/>
+        <w:spacing w:after="160" w:line="278" w:lineRule="auto"/>
       </w:pPr>
     </w:pPrDefault>
   </w:docDefaults>
-  <w:latentStyles w:count="276" w:defLockedState="0" w:defQFormat="0" w:defSemiHidden="0" w:defUIPriority="0" w:defUnhideWhenUsed="0"/>
+  <w:latentStyles w:count="376" w:defLockedState="0" w:defQFormat="0" w:defSemiHidden="0" w:defUIPriority="99" w:defUnhideWhenUsed="0">
+    <w:lsdException w:name="Normal" w:qFormat="1" w:uiPriority="0"/>
+    <w:lsdException w:name="heading 1" w:qFormat="1" w:uiPriority="9"/>
+    <w:lsdException w:name="heading 2" w:qFormat="1" w:semiHidden="1" w:uiPriority="9" w:unhideWhenUsed="1"/>
+    <w:lsdException w:name="heading 3" w:qFormat="1" w:semiHidden="1" w:uiPriority="9" w:unhideWhenUsed="1"/>
+    <w:lsdException w:name="heading 4" w:qFormat="1" w:semiHidden="1" w:uiPriority="9" w:unhideWhenUsed="1"/>
+    <w:lsdException w:name="heading 5" w:qFormat="1" w:semiHidden="1" w:uiPriority="9" w:unhideWhenUsed="1"/>
+    <w:lsdException w:name="heading 6" w:qFormat="1" w:semiHidden="1" w:uiPriority="9" w:unhideWhenUsed="1"/>
+    <w:lsdException w:name="heading 7" w:qFormat="1" w:semiHidden="1" w:uiPriority="9" w:unhideWhenUsed="1"/>
+    <w:lsdException w:name="heading 8" w:qFormat="1" w:semiHidden="1" w:uiPriority="9" w:unhideWhenUsed="1"/>
+    <w:lsdException w:name="heading 9" w:qFormat="1" w:semiHidden="1" w:uiPriority="9" w:unhideWhenUsed="1"/>
+    <w:lsdException w:name="index 1" w:semiHidden="1" w:unhideWhenUsed="1"/>
+    <w:lsdException w:name="index 2" w:semiHidden="1" w:unhideWhenUsed="1"/>
+    <w:lsdException w:name="index 3" w:semiHidden="1" w:unhideWhenUsed="1"/>
+    <w:lsdException w:name="index 4" w:semiHidden="1" w:unhideWhenUsed="1"/>
+    <w:lsdException w:name="index 5" w:semiHidden="1" w:unhideWhenUsed="1"/>
+    <w:lsdException w:name="index 6" w:semiHidden="1" w:unhideWhenUsed="1"/>
+    <w:lsdException w:name="index 7" w:semiHidden="1" w:unhideWhenUsed="1"/>
+    <w:lsdException w:name="index 8" w:semiHidden="1" w:unhideWhenUsed="1"/>
+    <w:lsdException w:name="index 9" w:semiHidden="1" w:unhideWhenUsed="1"/>
+    <w:lsdException w:name="toc 1" w:semiHidden="1" w:uiPriority="39" w:unhideWhenUsed="1"/>
+    <w:lsdException w:name="toc 2" w:semiHidden="1" w:uiPriority="39" w:unhideWhenUsed="1"/>
+    <w:lsdException w:name="toc 3" w:semiHidden="1" w:uiPriority="39" w:unhideWhenUsed="1"/>
+    <w:lsdException w:name="toc 4" w:semiHidden="1" w:uiPriority="39" w:unhideWhenUsed="1"/>
+    <w:lsdException w:name="toc 5" w:semiHidden="1" w:uiPriority="39" w:unhideWhenUsed="1"/>
+    <w:lsdException w:name="toc 6" w:semiHidden="1" w:uiPriority="39" w:unhideWhenUsed="1"/>
+    <w:lsdException w:name="toc 7" w:semiHidden="1" w:uiPriority="39" w:unhideWhenUsed="1"/>
+    <w:lsdException w:name="toc 8" w:semiHidden="1" w:uiPriority="39" w:unhideWhenUsed="1"/>
+    <w:lsdException w:name="toc 9" w:semiHidden="1" w:uiPriority="39" w:unhideWhenUsed="1"/>
+    <w:lsdException w:name="Normal Indent" w:semiHidden="1" w:unhideWhenUsed="1"/>
+    <w:lsdException w:name="footnote text" w:semiHidden="1" w:unhideWhenUsed="1"/>
+    <w:lsdException w:name="annotation text" w:semiHidden="1" w:unhideWhenUsed="1"/>
+    <w:lsdException w:name="header" w:semiHidden="1" w:unhideWhenUsed="1"/>
+    <w:lsdException w:name="footer" w:semiHidden="1" w:unhideWhenUsed="1"/>
+    <w:lsdException w:name="index heading" w:semiHidden="1" w:unhideWhenUsed="1"/>
+    <w:lsdException w:name="caption" w:qFormat="1" w:semiHidden="1" w:uiPriority="35" w:unhideWhenUsed="1"/>
+    <w:lsdException w:name="table of figures" w:semiHidden="1" w:unhideWhenUsed="1"/>
+    <w:lsdException w:name="envelope address" w:semiHidden="1" w:unhideWhenUsed="1"/>
+    <w:lsdException w:name="envelope return" w:semiHidden="1" w:unhideWhenUsed="1"/>
+    <w:lsdException w:name="footnote reference" w:semiHidden="1" w:unhideWhenUsed="1"/>
+    <w:lsdException w:name="annotation reference" w:semiHidden="1" w:unhideWhenUsed="1"/>
+    <w:lsdException w:name="line number" w:semiHidden="1" w:unhideWhenUsed="1"/>
+    <w:lsdException w:name="page number" w:semiHidden="1" w:unhideWhenUsed="1"/>
+    <w:lsdException w:name="endnote reference" w:semiHidden="1" w:unhideWhenUsed="1"/>
+    <w:lsdException w:name="endnote text" w:semiHidden="1" w:unhideWhenUsed="1"/>
+    <w:lsdException w:name="table of authorities" w:semiHidden="1" w:unhideWhenUsed="1"/>
+    <w:lsdException w:name="macro" w:semiHidden="1" w:unhideWhenUsed="1"/>
+    <w:lsdException w:name="toa heading" w:semiHidden="1" w:unhideWhenUsed="1"/>
+    <w:lsdException w:name="List" w:semiHidden="1" w:unhideWhenUsed="1"/>
+    <w:lsdException w:name="List Bullet" w:semiHidden="1" w:unhideWhenUsed="1"/>
+    <w:lsdException w:name="List Number" w:semiHidden="1" w:unhideWhenUsed="1"/>
+    <w:lsdException w:name="List 2" w:semiHidden="1" w:unhideWhenUsed="1"/>
+    <w:lsdException w:name="List 3" w:semiHidden="1" w:unhideWhenUsed="1"/>
+    <w:lsdException w:name="List 4" w:semiHidden="1" w:unhideWhenUsed="1"/>
+    <w:lsdException w:name="List 5" w:semiHidden="1" w:unhideWhenUsed="1"/>
+    <w:lsdException w:name="List Bullet 2" w:semiHidden="1" w:unhideWhenUsed="1"/>
+    <w:lsdException w:name="List Bullet 3" w:semiHidden="1" w:unhideWhenUsed="1"/>
+    <w:lsdException w:name="List Bullet 4" w:semiHidden="1" w:unhideWhenUsed="1"/>
+    <w:lsdException w:name="List Bullet 5" w:semiHidden="1" w:unhideWhenUsed="1"/>
+    <w:lsdException w:name="List Number 2" w:semiHidden="1" w:unhideWhenUsed="1"/>
+    <w:lsdException w:name="List Number 3" w:semiHidden="1" w:unhideWhenUsed="1"/>
+    <w:lsdException w:name="List Number 4" w:semiHidden="1" w:unhideWhenUsed="1"/>
+    <w:lsdException w:name="List Number 5" w:semiHidden="1" w:unhideWhenUsed="1"/>
+    <w:lsdException w:name="Title" w:qFormat="1" w:uiPriority="10"/>
+    <w:lsdException w:name="Closing" w:semiHidden="1" w:unhideWhenUsed="1"/>
+    <w:lsdException w:name="Signature" w:semiHidden="1" w:unhideWhenUsed="1"/>
+    <w:lsdException w:name="Default Paragraph Font" w:semiHidden="1" w:uiPriority="1" w:unhideWhenUsed="1"/>
+    <w:lsdException w:name="Body Text" w:semiHidden="1" w:unhideWhenUsed="1"/>
+    <w:lsdException w:name="Body Text Indent" w:semiHidden="1" w:unhideWhenUsed="1"/>
+    <w:lsdException w:name="List Continue" w:semiHidden="1" w:unhideWhenUsed="1"/>
+    <w:lsdException w:name="List Continue 2" w:semiHidden="1" w:unhideWhenUsed="1"/>
+    <w:lsdException w:name="List Continue 3" w:semiHidden="1" w:unhideWhenUsed="1"/>
+    <w:lsdException w:name="List Continue 4" w:semiHidden="1" w:unhideWhenUsed="1"/>
+    <w:lsdException w:name="List Continue 5" w:semiHidden="1" w:unhideWhenUsed="1"/>
+    <w:lsdException w:name="Message Header" w:semiHidden="1" w:unhideWhenUsed="1"/>
+    <w:lsdException w:name="Subtitle" w:qFormat="1" w:uiPriority="11"/>
+    <w:lsdException w:name="Salutation" w:semiHidden="1" w:unhideWhenUsed="1"/>
+    <w:lsdException w:name="Date" w:semiHidden="1" w:unhideWhenUsed="1"/>
+    <w:lsdException w:name="Body Text First Indent" w:semiHidden="1" w:unhideWhenUsed="1"/>
+    <w:lsdException w:name="Body Text First Indent 2" w:semiHidden="1" w:unhideWhenUsed="1"/>
+    <w:lsdException w:name="Note Heading" w:semiHidden="1" w:unhideWhenUsed="1"/>
+    <w:lsdException w:name="Body Text 2" w:semiHidden="1" w:unhideWhenUsed="1"/>
+    <w:lsdException w:name="Body Text 3" w:semiHidden="1" w:unhideWhenUsed="1"/>
+    <w:lsdException w:name="Body Text Indent 2" w:semiHidden="1" w:unhideWhenUsed="1"/>
+    <w:lsdException w:name="Body Text Indent 3" w:semiHidden="1" w:unhideWhenUsed="1"/>
+    <w:lsdException w:name="Block Text" w:semiHidden="1" w:unhideWhenUsed="1"/>
+    <w:lsdException w:name="Hyperlink" w:semiHidden="1" w:unhideWhenUsed="1"/>
+    <w:lsdException w:name="FollowedHyperlink" w:semiHidden="1" w:unhideWhenUsed="1"/>
+    <w:lsdException w:name="Strong" w:qFormat="1" w:uiPriority="22"/>
+    <w:lsdException w:name="Emphasis" w:qFormat="1" w:uiPriority="20"/>
+    <w:lsdException w:name="Document Map" w:semiHidden="1" w:unhideWhenUsed="1"/>
+    <w:lsdException w:name="Plain Text" w:semiHidden="1" w:unhideWhenUsed="1"/>
+    <w:lsdException w:name="E-mail Signature" w:semiHidden="1" w:unhideWhenUsed="1"/>
+    <w:lsdException w:name="HTML Top of Form" w:semiHidden="1" w:unhideWhenUsed="1"/>
+    <w:lsdException w:name="HTML Bottom of Form" w:semiHidden="1" w:unhideWhenUsed="1"/>
+    <w:lsdException w:name="Normal (Web)" w:semiHidden="1" w:unhideWhenUsed="1"/>
+    <w:lsdException w:name="HTML Acronym" w:semiHidden="1" w:unhideWhenUsed="1"/>
+    <w:lsdException w:name="HTML Address" w:semiHidden="1" w:unhideWhenUsed="1"/>
+    <w:lsdException w:name="HTML Cite" w:semiHidden="1" w:unhideWhenUsed="1"/>
+    <w:lsdException w:name="HTML Code" w:semiHidden="1" w:unhideWhenUsed="1"/>
+    <w:lsdException w:name="HTML Definition" w:semiHidden="1" w:unhideWhenUsed="1"/>
+    <w:lsdException w:name="HTML Keyboard" w:semiHidden="1" w:unhideWhenUsed="1"/>
+    <w:lsdException w:name="HTML Preformatted" w:semiHidden="1" w:unhideWhenUsed="1"/>
+    <w:lsdException w:name="HTML Sample" w:semiHidden="1" w:unhideWhenUsed="1"/>
+    <w:lsdException w:name="HTML Typewriter" w:semiHidden="1" w:unhideWhenUsed="1"/>
+    <w:lsdException w:name="HTML Variable" w:semiHidden="1" w:unhideWhenUsed="1"/>
+    <w:lsdException w:name="Normal Table" w:semiHidden="1" w:unhideWhenUsed="1"/>
+    <w:lsdException w:name="annotation subject" w:semiHidden="1" w:unhideWhenUsed="1"/>
+    <w:lsdException w:name="No List" w:semiHidden="1" w:unhideWhenUsed="1"/>
+    <w:lsdException w:name="Outline List 1" w:semiHidden="1" w:unhideWhenUsed="1"/>
+    <w:lsdException w:name="Outline List 2" w:semiHidden="1" w:unhideWhenUsed="1"/>
+    <w:lsdException w:name="Outline List 3" w:semiHidden="1" w:unhideWhenUsed="1"/>
+    <w:lsdException w:name="Table Simple 1" w:semiHidden="1" w:unhideWhenUsed="1"/>
+    <w:lsdException w:name="Table Simple 2" w:semiHidden="1" w:unhideWhenUsed="1"/>
+    <w:lsdException w:name="Table Simple 3" w:semiHidden="1" w:unhideWhenUsed="1"/>
+    <w:lsdException w:name="Table Classic 1" w:semiHidden="1" w:unhideWhenUsed="1"/>
+    <w:lsdException w:name="Table Classic 2" w:semiHidden="1" w:unhideWhenUsed="1"/>
+    <w:lsdException w:name="Table Classic 3" w:semiHidden="1" w:unhideWhenUsed="1"/>
+    <w:lsdException w:name="Table Classic 4" w:semiHidden="1" w:unhideWhenUsed="1"/>
+    <w:lsdException w:name="Table Colorful 1" w:semiHidden="1" w:unhideWhenUsed="1"/>
+    <w:lsdException w:name="Table Colorful 2" w:semiHidden="1" w:unhideWhenUsed="1"/>
+    <w:lsdException w:name="Table Colorful 3" w:semiHidden="1" w:unhideWhenUsed="1"/>
+    <w:lsdException w:name="Table Columns 1" w:semiHidden="1" w:unhideWhenUsed="1"/>
+    <w:lsdException w:name="Table Columns 2" w:semiHidden="1" w:unhideWhenUsed="1"/>
+    <w:lsdException w:name="Table Columns 3" w:semiHidden="1" w:unhideWhenUsed="1"/>
+    <w:lsdException w:name="Table Columns 4" w:semiHidden="1" w:unhideWhenUsed="1"/>
+    <w:lsdException w:name="Table Columns 5" w:semiHidden="1" w:unhideWhenUsed="1"/>
+    <w:lsdException w:name="Table Grid 1" w:semiHidden="1" w:unhideWhenUsed="1"/>
+    <w:lsdException w:name="Table Grid 2" w:semiHidden="1" w:unhideWhenUsed="1"/>
+    <w:lsdException w:name="Table Grid 3" w:semiHidden="1" w:unhideWhenUsed="1"/>
+    <w:lsdException w:name="Table Grid 4" w:semiHidden="1" w:unhideWhenUsed="1"/>
+    <w:lsdException w:name="Table Grid 5" w:semiHidden="1" w:unhideWhenUsed="1"/>
+    <w:lsdException w:name="Table Grid 6" w:semiHidden="1" w:unhideWhenUsed="1"/>
+    <w:lsdException w:name="Table Grid 7" w:semiHidden="1" w:unhideWhenUsed="1"/>
+    <w:lsdException w:name="Table Grid 8" w:semiHidden="1" w:unhideWhenUsed="1"/>
+    <w:lsdException w:name="Table List 1" w:semiHidden="1" w:unhideWhenUsed="1"/>
+    <w:lsdException w:name="Table List 2" w:semiHidden="1" w:unhideWhenUsed="1"/>
+    <w:lsdException w:name="Table List 3" w:semiHidden="1" w:unhideWhenUsed="1"/>
+    <w:lsdException w:name="Table List 4" w:semiHidden="1" w:unhideWhenUsed="1"/>
+    <w:lsdException w:name="Table List 5" w:semiHidden="1" w:unhideWhenUsed="1"/>
+    <w:lsdException w:name="Table List 6" w:semiHidden="1" w:unhideWhenUsed="1"/>
+    <w:lsdException w:name="Table List 7" w:semiHidden="1" w:unhideWhenUsed="1"/>
+    <w:lsdException w:name="Table List 8" w:semiHidden="1" w:unhideWhenUsed="1"/>
+    <w:lsdException w:name="Table 3D effects 1" w:semiHidden="1" w:unhideWhenUsed="1"/>
+    <w:lsdException w:name="Table 3D effects 2" w:semiHidden="1" w:unhideWhenUsed="1"/>
+    <w:lsdException w:name="Table 3D effects 3" w:semiHidden="1" w:unhideWhenUsed="1"/>
+    <w:lsdException w:name="Table Contemporary" w:semiHidden="1" w:unhideWhenUsed="1"/>
+    <w:lsdException w:name="Table Elegant" w:semiHidden="1" w:unhideWhenUsed="1"/>
+    <w:lsdException w:name="Table Professional" w:semiHidden="1" w:unhideWhenUsed="1"/>
+    <w:lsdException w:name="Table Subtle 1" w:semiHidden="1" w:unhideWhenUsed="1"/>
+    <w:lsdException w:name="Table Subtle 2" w:semiHidden="1" w:unhideWhenUsed="1"/>
+    <w:lsdException w:name="Table Web 1" w:semiHidden="1" w:unhideWhenUsed="1"/>
+    <w:lsdException w:name="Table Web 2" w:semiHidden="1" w:unhideWhenUsed="1"/>
+    <w:lsdException w:name="Table Web 3" w:semiHidden="1" w:unhideWhenUsed="1"/>
+    <w:lsdException w:name="Balloon Text" w:semiHidden="1" w:unhideWhenUsed="1"/>
+    <w:lsdException w:name="Table Grid" w:uiPriority="39"/>
+    <w:lsdException w:name="Table Theme" w:semiHidden="1" w:unhideWhenUsed="1"/>
+    <w:lsdException w:name="Placeholder Text" w:semiHidden="1"/>
+    <w:lsdException w:name="No Spacing" w:qFormat="1" w:uiPriority="1"/>
+    <w:lsdException w:name="Light Shading" w:uiPriority="60"/>
+    <w:lsdException w:name="Light List" w:uiPriority="61"/>
+    <w:lsdException w:name="Light Grid" w:uiPriority="62"/>
+    <w:lsdException w:name="Medium Shading 1" w:uiPriority="63"/>
+    <w:lsdException w:name="Medium Shading 2" w:uiPriority="64"/>
+    <w:lsdException w:name="Medium List 1" w:uiPriority="65"/>
+    <w:lsdException w:name="Medium List 2" w:uiPriority="66"/>
+    <w:lsdException w:name="Medium Grid 1" w:uiPriority="67"/>
+    <w:lsdException w:name="Medium Grid 2" w:uiPriority="68"/>
+    <w:lsdException w:name="Medium Grid 3" w:uiPriority="69"/>
+    <w:lsdException w:name="Dark List" w:uiPriority="70"/>
+    <w:lsdException w:name="Colorful Shading" w:uiPriority="71"/>
+    <w:lsdException w:name="Colorful List" w:uiPriority="72"/>
+    <w:lsdException w:name="Colorful Grid" w:uiPriority="73"/>
+    <w:lsdException w:name="Light Shading Accent 1" w:uiPriority="60"/>
+    <w:lsdException w:name="Light List Accent 1" w:uiPriority="61"/>
+    <w:lsdException w:name="Light Grid Accent 1" w:uiPriority="62"/>
+    <w:lsdException w:name="Medium Shading 1 Accent 1" w:uiPriority="63"/>
+    <w:lsdException w:name="Medium Shading 2 Accent 1" w:uiPriority="64"/>
+    <w:lsdException w:name="Medium List 1 Accent 1" w:uiPriority="65"/>
+    <w:lsdException w:name="Revision" w:semiHidden="1"/>
+    <w:lsdException w:name="List Paragraph" w:qFormat="1" w:uiPriority="34"/>
+    <w:lsdException w:name="Quote" w:qFormat="1" w:uiPriority="29"/>
+    <w:lsdException w:name="Intense Quote" w:qFormat="1" w:uiPriority="30"/>
+    <w:lsdException w:name="Medium List 2 Accent 1" w:uiPriority="66"/>
+    <w:lsdException w:name="Medium Grid 1 Accent 1" w:uiPriority="67"/>
+    <w:lsdException w:name="Medium Grid 2 Accent 1" w:uiPriority="68"/>
+    <w:lsdException w:name="Medium Grid 3 Accent 1" w:uiPriority="69"/>
+    <w:lsdException w:name="Dark List Accent 1" w:uiPriority="70"/>
+    <w:lsdException w:name="Colorful Shading Accent 1" w:uiPriority="71"/>
+    <w:lsdException w:name="Colorful List Accent 1" w:uiPriority="72"/>
+    <w:lsdException w:name="Colorful Grid Accent 1" w:uiPriority="73"/>
+    <w:lsdException w:name="Light Shading Accent 2" w:uiPriority="60"/>
+    <w:lsdException w:name="Light List Accent 2" w:uiPriority="61"/>
+    <w:lsdException w:name="Light Grid Accent 2" w:uiPriority="62"/>
+    <w:lsdException w:name="Medium Shading 1 Accent 2" w:uiPriority="63"/>
+    <w:lsdException w:name="Medium Shading 2 Accent 2" w:uiPriority="64"/>
+    <w:lsdException w:name="Medium List 1 Accent 2" w:uiPriority="65"/>
+    <w:lsdException w:name="Medium List 2 Accent 2" w:uiPriority="66"/>
+    <w:lsdException w:name="Medium Grid 1 Accent 2" w:uiPriority="67"/>
+    <w:lsdException w:name="Medium Grid 2 Accent 2" w:uiPriority="68"/>
+    <w:lsdException w:name="Medium Grid 3 Accent 2" w:uiPriority="69"/>
+    <w:lsdException w:name="Dark List Accent 2" w:uiPriority="70"/>
+    <w:lsdException w:name="Colorful Shading Accent 2" w:uiPriority="71"/>
+    <w:lsdException w:name="Colorful List Accent 2" w:uiPriority="72"/>
+    <w:lsdException w:name="Colorful Grid Accent 2" w:uiPriority="73"/>
+    <w:lsdException w:name="Light Shading Accent 3" w:uiPriority="60"/>
+    <w:lsdException w:name="Light List Accent 3" w:uiPriority="61"/>
+    <w:lsdException w:name="Light Grid Accent 3" w:uiPriority="62"/>
+    <w:lsdException w:name="Medium Shading 1 Accent 3" w:uiPriority="63"/>
+    <w:lsdException w:name="Medium Shading 2 Accent 3" w:uiPriority="64"/>
+    <w:lsdException w:name="Medium List 1 Accent 3" w:uiPriority="65"/>
+    <w:lsdException w:name="Medium List 2 Accent 3" w:uiPriority="66"/>
+    <w:lsdException w:name="Medium Grid 1 Accent 3" w:uiPriority="67"/>
+    <w:lsdException w:name="Medium Grid 2 Accent 3" w:uiPriority="68"/>
+    <w:lsdException w:name="Medium Grid 3 Accent 3" w:uiPriority="69"/>
+    <w:lsdException w:name="Dark List Accent 3" w:uiPriority="70"/>
+    <w:lsdException w:name="Colorful Shading Accent 3" w:uiPriority="71"/>
+    <w:lsdException w:name="Colorful List Accent 3" w:uiPriority="72"/>
+    <w:lsdException w:name="Colorful Grid Accent 3" w:uiPriority="73"/>
+    <w:lsdException w:name="Light Shading Accent 4" w:uiPriority="60"/>
+    <w:lsdException w:name="Light List Accent 4" w:uiPriority="61"/>
+    <w:lsdException w:name="Light Grid Accent 4" w:uiPriority="62"/>
+    <w:lsdException w:name="Medium Shading 1 Accent 4" w:uiPriority="63"/>
+    <w:lsdException w:name="Medium Shading 2 Accent 4" w:uiPriority="64"/>
+    <w:lsdException w:name="Medium List 1 Accent 4" w:uiPriority="65"/>
+    <w:lsdException w:name="Medium List 2 Accent 4" w:uiPriority="66"/>
+    <w:lsdException w:name="Medium Grid 1 Accent 4" w:uiPriority="67"/>
+    <w:lsdException w:name="Medium Grid 2 Accent 4" w:uiPriority="68"/>
+    <w:lsdException w:name="Medium Grid 3 Accent 4" w:uiPriority="69"/>
+    <w:lsdException w:name="Dark List Accent 4" w:uiPriority="70"/>
+    <w:lsdException w:name="Colorful Shading Accent 4" w:uiPriority="71"/>
+    <w:lsdException w:name="Colorful List Accent 4" w:uiPriority="72"/>
+    <w:lsdException w:name="Colorful Grid Accent 4" w:uiPriority="73"/>
+    <w:lsdException w:name="Light Shading Accent 5" w:uiPriority="60"/>
+    <w:lsdException w:name="Light List Accent 5" w:uiPriority="61"/>
+    <w:lsdException w:name="Light Grid Accent 5" w:uiPriority="62"/>
+    <w:lsdException w:name="Medium Shading 1 Accent 5" w:uiPriority="63"/>
+    <w:lsdException w:name="Medium Shading 2 Accent 5" w:uiPriority="64"/>
+    <w:lsdException w:name="Medium List 1 Accent 5" w:uiPriority="65"/>
+    <w:lsdException w:name="Medium List 2 Accent 5" w:uiPriority="66"/>
+    <w:lsdException w:name="Medium Grid 1 Accent 5" w:uiPriority="67"/>
+    <w:lsdException w:name="Medium Grid 2 Accent 5" w:uiPriority="68"/>
+    <w:lsdException w:name="Medium Grid 3 Accent 5" w:uiPriority="69"/>
+    <w:lsdException w:name="Dark List Accent 5" w:uiPriority="70"/>
+    <w:lsdException w:name="Colorful Shading Accent 5" w:uiPriority="71"/>
+    <w:lsdException w:name="Colorful List Accent 5" w:uiPriority="72"/>
+    <w:lsdException w:name="Colorful Grid Accent 5" w:uiPriority="73"/>
+    <w:lsdException w:name="Light Shading Accent 6" w:uiPriority="60"/>
+    <w:lsdException w:name="Light List Accent 6" w:uiPriority="61"/>
+    <w:lsdException w:name="Light Grid Accent 6" w:uiPriority="62"/>
+    <w:lsdException w:name="Medium Shading 1 Accent 6" w:uiPriority="63"/>
+    <w:lsdException w:name="Medium Shading 2 Accent 6" w:uiPriority="64"/>
+    <w:lsdException w:name="Medium List 1 Accent 6" w:uiPriority="65"/>
+    <w:lsdException w:name="Medium List 2 Accent 6" w:uiPriority="66"/>
+    <w:lsdException w:name="Medium Grid 1 Accent 6" w:uiPriority="67"/>
+    <w:lsdException w:name="Medium Grid 2 Accent 6" w:uiPriority="68"/>
+    <w:lsdException w:name="Medium Grid 3 Accent 6" w:uiPriority="69"/>
+    <w:lsdException w:name="Dark List Accent 6" w:uiPriority="70"/>
+    <w:lsdException w:name="Colorful Shading Accent 6" w:uiPriority="71"/>
+    <w:lsdException w:name="Colorful List Accent 6" w:uiPriority="72"/>
+    <w:lsdException w:name="Colorful Grid Accent 6" w:uiPriority="73"/>
+    <w:lsdException w:name="Subtle Emphasis" w:qFormat="1" w:uiPriority="19"/>
+    <w:lsdException w:name="Intense Emphasis" w:qFormat="1" w:uiPriority="21"/>
+    <w:lsdException w:name="Subtle Reference" w:qFormat="1" w:uiPriority="31"/>
+    <w:lsdException w:name="Intense Reference" w:qFormat="1" w:uiPriority="32"/>
+    <w:lsdException w:name="Book Title" w:qFormat="1" w:uiPriority="33"/>
+    <w:lsdException w:name="Bibliography" w:semiHidden="1" w:uiPriority="37" w:unhideWhenUsed="1"/>
+    <w:lsdException w:name="TOC Heading" w:qFormat="1" w:semiHidden="1" w:uiPriority="39" w:unhideWhenUsed="1"/>
+    <w:lsdException w:name="Plain Table 1" w:uiPriority="41"/>
+    <w:lsdException w:name="Plain Table 2" w:uiPriority="42"/>
+    <w:lsdException w:name="Plain Table 3" w:uiPriority="43"/>
+    <w:lsdException w:name="Plain Table 4" w:uiPriority="44"/>
+    <w:lsdException w:name="Plain Table 5" w:uiPriority="45"/>
+    <w:lsdException w:name="Grid Table Light" w:uiPriority="40"/>
+    <w:lsdException w:name="Grid Table 1 Light" w:uiPriority="46"/>
+    <w:lsdException w:name="Grid Table 2" w:uiPriority="47"/>
+    <w:lsdException w:name="Grid Table 3" w:uiPriority="48"/>
+    <w:lsdException w:name="Grid Table 4" w:uiPriority="49"/>
+    <w:lsdException w:name="Grid Table 5 Dark" w:uiPriority="50"/>
+    <w:lsdException w:name="Grid Table 6 Colorful" w:uiPriority="51"/>
+    <w:lsdException w:name="Grid Table 7 Colorful" w:uiPriority="52"/>
+    <w:lsdException w:name="Grid Table 1 Light Accent 1" w:uiPriority="46"/>
+    <w:lsdException w:name="Grid Table 2 Accent 1" w:uiPriority="47"/>
+    <w:lsdException w:name="Grid Table 3 Accent 1" w:uiPriority="48"/>
+    <w:lsdException w:name="Grid Table 4 Accent 1" w:uiPriority="49"/>
+    <w:lsdException w:name="Grid Table 5 Dark Accent 1" w:uiPriority="50"/>
+    <w:lsdException w:name="Grid Table 6 Colorful Accent 1" w:uiPriority="51"/>
+    <w:lsdException w:name="Grid Table 7 Colorful Accent 1" w:uiPriority="52"/>
+    <w:lsdException w:name="Grid Table 1 Light Accent 2" w:uiPriority="46"/>
+    <w:lsdException w:name="Grid Table 2 Accent 2" w:uiPriority="47"/>
+    <w:lsdException w:name="Grid Table 3 Accent 2" w:uiPriority="48"/>
+    <w:lsdException w:name="Grid Table 4 Accent 2" w:uiPriority="49"/>
+    <w:lsdException w:name="Grid Table 5 Dark Accent 2" w:uiPriority="50"/>
+    <w:lsdException w:name="Grid Table 6 Colorful Accent 2" w:uiPriority="51"/>
+    <w:lsdException w:name="Grid Table 7 Colorful Accent 2" w:uiPriority="52"/>
+    <w:lsdException w:name="Grid Table 1 Light Accent 3" w:uiPriority="46"/>
+    <w:lsdException w:name="Grid Table 2 Accent 3" w:uiPriority="47"/>
+    <w:lsdException w:name="Grid Table 3 Accent 3" w:uiPriority="48"/>
+    <w:lsdException w:name="Grid Table 4 Accent 3" w:uiPriority="49"/>
+    <w:lsdException w:name="Grid Table 5 Dark Accent 3" w:uiPriority="50"/>
+    <w:lsdException w:name="Grid Table 6 Colorful Accent 3" w:uiPriority="51"/>
+    <w:lsdException w:name="Grid Table 7 Colorful Accent 3" w:uiPriority="52"/>
+    <w:lsdException w:name="Grid Table 1 Light Accent 4" w:uiPriority="46"/>
+    <w:lsdException w:name="Grid Table 2 Accent 4" w:uiPriority="47"/>
+    <w:lsdException w:name="Grid Table 3 Accent 4" w:uiPriority="48"/>
+    <w:lsdException w:name="Grid Table 4 Accent 4" w:uiPriority="49"/>
+    <w:lsdException w:name="Grid Table 5 Dark Accent 4" w:uiPriority="50"/>
+    <w:lsdException w:name="Grid Table 6 Colorful Accent 4" w:uiPriority="51"/>
+    <w:lsdException w:name="Grid Table 7 Colorful Accent 4" w:uiPriority="52"/>
+    <w:lsdException w:name="Grid Table 1 Light Accent 5" w:uiPriority="46"/>
+    <w:lsdException w:name="Grid Table 2 Accent 5" w:uiPriority="47"/>
+    <w:lsdException w:name="Grid Table 3 Accent 5" w:uiPriority="48"/>
+    <w:lsdException w:name="Grid Table 4 Accent 5" w:uiPriority="49"/>
+    <w:lsdException w:name="Grid Table 5 Dark Accent 5" w:uiPriority="50"/>
+    <w:lsdException w:name="Grid Table 6 Colorful Accent 5" w:uiPriority="51"/>
+    <w:lsdException w:name="Grid Table 7 Colorful Accent 5" w:uiPriority="52"/>
+    <w:lsdException w:name="Grid Table 1 Light Accent 6" w:uiPriority="46"/>
+    <w:lsdException w:name="Grid Table 2 Accent 6" w:uiPriority="47"/>
+    <w:lsdException w:name="Grid Table 3 Accent 6" w:uiPriority="48"/>
+    <w:lsdException w:name="Grid Table 4 Accent 6" w:uiPriority="49"/>
+    <w:lsdException w:name="Grid Table 5 Dark Accent 6" w:uiPriority="50"/>
+    <w:lsdException w:name="Grid Table 6 Colorful Accent 6" w:uiPriority="51"/>
+    <w:lsdException w:name="Grid Table 7 Colorful Accent 6" w:uiPriority="52"/>
+    <w:lsdException w:name="List Table 1 Light" w:uiPriority="46"/>
+    <w:lsdException w:name="List Table 2" w:uiPriority="47"/>
+    <w:lsdException w:name="List Table 3" w:uiPriority="48"/>
+    <w:lsdException w:name="List Table 4" w:uiPriority="49"/>
+    <w:lsdException w:name="List Table 5 Dark" w:uiPriority="50"/>
+    <w:lsdException w:name="List Table 6 Colorful" w:uiPriority="51"/>
+    <w:lsdException w:name="List Table 7 Colorful" w:uiPriority="52"/>
+    <w:lsdException w:name="List Table 1 Light Accent 1" w:uiPriority="46"/>
+    <w:lsdException w:name="List Table 2 Accent 1" w:uiPriority="47"/>
+    <w:lsdException w:name="List Table 3 Accent 1" w:uiPriority="48"/>
+    <w:lsdException w:name="List Table 4 Accent 1" w:uiPriority="49"/>
+    <w:lsdException w:name="List Table 5 Dark Accent 1" w:uiPriority="50"/>
+    <w:lsdException w:name="List Table 6 Colorful Accent 1" w:uiPriority="51"/>
+    <w:lsdException w:name="List Table 7 Colorful Accent 1" w:uiPriority="52"/>
+    <w:lsdException w:name="List Table 1 Light Accent 2" w:uiPriority="46"/>
+    <w:lsdException w:name="List Table 2 Accent 2" w:uiPriority="47"/>
+    <w:lsdException w:name="List Table 3 Accent 2" w:uiPriority="48"/>
+    <w:lsdException w:name="List Table 4 Accent 2" w:uiPriority="49"/>
+    <w:lsdException w:name="List Table 5 Dark Accent 2" w:uiPriority="50"/>
+    <w:lsdException w:name="List Table 6 Colorful Accent 2" w:uiPriority="51"/>
+    <w:lsdException w:name="List Table 7 Colorful Accent 2" w:uiPriority="52"/>
+    <w:lsdException w:name="List Table 1 Light Accent 3" w:uiPriority="46"/>
+    <w:lsdException w:name="List Table 2 Accent 3" w:uiPriority="47"/>
+    <w:lsdException w:name="List Table 3 Accent 3" w:uiPriority="48"/>
+    <w:lsdException w:name="List Table 4 Accent 3" w:uiPriority="49"/>
+    <w:lsdException w:name="List Table 5 Dark Accent 3" w:uiPriority="50"/>
+    <w:lsdException w:name="List Table 6 Colorful Accent 3" w:uiPriority="51"/>
+    <w:lsdException w:name="List Table 7 Colorful Accent 3" w:uiPriority="52"/>
+    <w:lsdException w:name="List Table 1 Light Accent 4" w:uiPriority="46"/>
+    <w:lsdException w:name="List Table 2 Accent 4" w:uiPriority="47"/>
+    <w:lsdException w:name="List Table 3 Accent 4" w:uiPriority="48"/>
+    <w:lsdException w:name="List Table 4 Accent 4" w:uiPriority="49"/>
+    <w:lsdException w:name="List Table 5 Dark Accent 4" w:uiPriority="50"/>
+    <w:lsdException w:name="List Table 6 Colorful Accent 4" w:uiPriority="51"/>
+    <w:lsdException w:name="List Table 7 Colorful Accent 4" w:uiPriority="52"/>
+    <w:lsdException w:name="List Table 1 Light Accent 5" w:uiPriority="46"/>
+    <w:lsdException w:name="List Table 2 Accent 5" w:uiPriority="47"/>
+    <w:lsdException w:name="List Table 3 Accent 5" w:uiPriority="48"/>
+    <w:lsdException w:name="List Table 4 Accent 5" w:uiPriority="49"/>
+    <w:lsdException w:name="List Table 5 Dark Accent 5" w:uiPriority="50"/>
+    <w:lsdException w:name="List Table 6 Colorful Accent 5" w:uiPriority="51"/>
+    <w:lsdException w:name="List Table 7 Colorful Accent 5" w:uiPriority="52"/>
+    <w:lsdException w:name="List Table 1 Light Accent 6" w:uiPriority="46"/>
+    <w:lsdException w:name="List Table 2 Accent 6" w:uiPriority="47"/>
+    <w:lsdException w:name="List Table 3 Accent 6" w:uiPriority="48"/>
+    <w:lsdException w:name="List Table 4 Accent 6" w:uiPriority="49"/>
+    <w:lsdException w:name="List Table 5 Dark Accent 6" w:uiPriority="50"/>
+    <w:lsdException w:name="List Table 6 Colorful Accent 6" w:uiPriority="51"/>
+    <w:lsdException w:name="List Table 7 Colorful Accent 6" w:uiPriority="52"/>
+    <w:lsdException w:name="Mention" w:semiHidden="1" w:unhideWhenUsed="1"/>
+    <w:lsdException w:name="Smart Hyperlink" w:semiHidden="1" w:unhideWhenUsed="1"/>
+    <w:lsdException w:name="Hashtag" w:semiHidden="1" w:unhideWhenUsed="1"/>
+    <w:lsdException w:name="Unresolved Mention" w:semiHidden="1" w:unhideWhenUsed="1"/>
+    <w:lsdException w:name="Smart Link" w:semiHidden="1" w:unhideWhenUsed="1"/>
+  </w:latentStyles>
   <w:style w:default="1" w:styleId="Normal" w:type="paragraph">
     <w:name w:val="Normal"/>
     <w:qFormat/>
   </w:style>
-  <w:style w:styleId="BodyText" w:type="paragraph">
-    <w:name w:val="Body Text"/>
-    <w:basedOn w:val="Normal"/>
-    <w:link w:val="BodyTextChar"/>
-    <w:qFormat/>
-    <w:pPr>
-      <w:spacing w:after="180" w:before="180"/>
-    </w:pPr>
-  </w:style>
-  <w:style w:customStyle="1" w:styleId="FirstParagraph" w:type="paragraph">
-    <w:name w:val="First Paragraph"/>
-    <w:basedOn w:val="BodyText"/>
-    <w:next w:val="BodyText"/>
-    <w:qFormat/>
-  </w:style>
-  <w:style w:customStyle="1" w:styleId="Compact" w:type="paragraph">
-    <w:name w:val="Compact"/>
-    <w:basedOn w:val="BodyText"/>
-    <w:qFormat/>
-    <w:pPr>
-      <w:spacing w:after="36" w:before="36"/>
-    </w:pPr>
-  </w:style>
-  <w:style w:styleId="Title" w:type="paragraph">
-    <w:name w:val="Title"/>
-    <w:basedOn w:val="Normal"/>
-    <w:next w:val="BodyText"/>
-    <w:link w:val="TitleChar"/>
-    <w:uiPriority w:val="10"/>
-    <w:qFormat/>
-    <w:rsid w:val="00A10FD9"/>
-    <w:pPr>
-      <w:spacing w:after="80" w:line="240" w:lineRule="auto"/>
-      <w:contextualSpacing/>
-      <w:jc w:val="center"/>
-    </w:pPr>
-    <w:rPr>
-      <w:rFonts w:asciiTheme="majorHAnsi" w:cstheme="majorBidi" w:eastAsiaTheme="majorEastAsia" w:hAnsiTheme="majorHAnsi"/>
-      <w:sz w:val="56"/>
-      <w:szCs w:val="56"/>
-    </w:rPr>
-  </w:style>
-  <w:style w:customStyle="1" w:styleId="TitleChar" w:type="character">
-    <w:name w:val="Title Char"/>
-    <w:basedOn w:val="DefaultParagraphFont"/>
-    <w:link w:val="Title"/>
-    <w:uiPriority w:val="10"/>
-    <w:rsid w:val="00A10FD9"/>
-    <w:rPr>
-      <w:rFonts w:asciiTheme="majorHAnsi" w:cstheme="majorBidi" w:eastAsiaTheme="majorEastAsia" w:hAnsiTheme="majorHAnsi"/>
-      <w:sz w:val="56"/>
-      <w:szCs w:val="56"/>
-    </w:rPr>
-  </w:style>
-  <w:style w:styleId="Subtitle" w:type="paragraph">
-    <w:name w:val="Subtitle"/>
-    <w:basedOn w:val="Title"/>
-    <w:next w:val="BodyText"/>
-    <w:link w:val="SubtitleChar"/>
-    <w:uiPriority w:val="11"/>
-    <w:qFormat/>
-    <w:rsid w:val="00A10FD9"/>
-    <w:pPr>
-      <w:numPr>
-        <w:ilvl w:val="1"/>
-      </w:numPr>
-    </w:pPr>
-    <w:rPr>
-      <w:rFonts w:cstheme="majorBidi" w:eastAsiaTheme="majorEastAsia"/>
-      <w:spacing w:val="15"/>
-      <w:sz w:val="28"/>
-      <w:szCs w:val="28"/>
-    </w:rPr>
-  </w:style>
-  <w:style w:customStyle="1" w:styleId="SubtitleChar" w:type="character">
-    <w:name w:val="Subtitle Char"/>
-    <w:basedOn w:val="DefaultParagraphFont"/>
-    <w:link w:val="Subtitle"/>
-    <w:uiPriority w:val="11"/>
-    <w:rsid w:val="00A10FD9"/>
-    <w:rPr>
-      <w:rFonts w:cstheme="majorBidi" w:eastAsiaTheme="majorEastAsia"/>
-      <w:color w:themeColor="text1" w:themeTint="A6" w:val="595959"/>
-      <w:spacing w:val="15"/>
-      <w:sz w:val="28"/>
-      <w:szCs w:val="28"/>
-    </w:rPr>
-  </w:style>
-  <w:style w:customStyle="1" w:styleId="Author" w:type="paragraph">
-    <w:name w:val="Author"/>
-    <w:basedOn w:val="Title"/>
-    <w:next w:val="BodyText"/>
-    <w:qFormat/>
-    <w:pPr>
-      <w:keepNext/>
-      <w:keepLines/>
-    </w:pPr>
-    <w:rPr>
-      <w:sz w:val="24"/>
-      <w:szCs w:val="24"/>
-    </w:rPr>
-  </w:style>
-  <w:style w:styleId="Date" w:type="paragraph">
-    <w:name w:val="Date"/>
-    <w:basedOn w:val="Title"/>
-    <w:next w:val="BodyText"/>
-    <w:qFormat/>
-    <w:pPr>
-      <w:keepNext/>
-      <w:keepLines/>
-    </w:pPr>
-    <w:rPr>
-      <w:sz w:val="24"/>
-      <w:szCs w:val="24"/>
-    </w:rPr>
-  </w:style>
-  <w:style w:customStyle="1" w:styleId="AbstractTitle" w:type="paragraph">
-    <w:name w:val="Abstract Title"/>
-    <w:basedOn w:val="Normal"/>
-    <w:next w:val="Abstract"/>
-    <w:qFormat/>
-    <w:pPr>
-      <w:keepNext/>
-      <w:keepLines/>
-      <w:spacing w:after="0" w:before="300"/>
-      <w:jc w:val="center"/>
-    </w:pPr>
-    <w:rPr>
-      <w:b/>
-      <w:sz w:val="20"/>
-      <w:szCs w:val="20"/>
-    </w:rPr>
-  </w:style>
-  <w:style w:customStyle="1" w:styleId="Abstract" w:type="paragraph">
-    <w:name w:val="Abstract"/>
-    <w:basedOn w:val="Normal"/>
-    <w:next w:val="BodyText"/>
-    <w:qFormat/>
-    <w:pPr>
-      <w:keepNext/>
-      <w:keepLines/>
-      <w:spacing w:after="300" w:before="100"/>
-    </w:pPr>
-    <w:rPr>
-      <w:sz w:val="20"/>
-      <w:szCs w:val="20"/>
-    </w:rPr>
-  </w:style>
-  <w:style w:styleId="Bibliography" w:type="paragraph">
-    <w:name w:val="Bibliography"/>
-    <w:basedOn w:val="Normal"/>
-    <w:next w:val="Bibliography"/>
-    <w:qFormat/>
-    <w:pPr/>
-    <w:rPr/>
-  </w:style>
   <w:style w:styleId="Heading1" w:type="paragraph">
     <w:name w:val="heading 1"/>
     <w:basedOn w:val="Normal"/>
-    <w:next w:val="BodyText"/>
+    <w:next w:val="Normal"/>
     <w:link w:val="Heading1Char"/>
     <w:uiPriority w:val="9"/>
     <w:qFormat/>
-    <w:rsid w:val="00A10FD9"/>
+    <w:rsid w:val="00917918"/>
     <w:pPr>
       <w:keepNext/>
       <w:keepLines/>
@@ -778,13 +1032,13 @@
   <w:style w:styleId="Heading2" w:type="paragraph">
     <w:name w:val="heading 2"/>
     <w:basedOn w:val="Normal"/>
-    <w:next w:val="BodyText"/>
+    <w:next w:val="Normal"/>
     <w:link w:val="Heading2Char"/>
     <w:uiPriority w:val="9"/>
     <w:semiHidden/>
     <w:unhideWhenUsed/>
     <w:qFormat/>
-    <w:rsid w:val="00A10FD9"/>
+    <w:rsid w:val="00917918"/>
     <w:pPr>
       <w:keepNext/>
       <w:keepLines/>
@@ -801,13 +1055,13 @@
   <w:style w:styleId="Heading3" w:type="paragraph">
     <w:name w:val="heading 3"/>
     <w:basedOn w:val="Normal"/>
-    <w:next w:val="BodyText"/>
+    <w:next w:val="Normal"/>
     <w:link w:val="Heading3Char"/>
     <w:uiPriority w:val="9"/>
     <w:semiHidden/>
     <w:unhideWhenUsed/>
     <w:qFormat/>
-    <w:rsid w:val="00A10FD9"/>
+    <w:rsid w:val="00917918"/>
     <w:pPr>
       <w:keepNext/>
       <w:keepLines/>
@@ -824,13 +1078,13 @@
   <w:style w:styleId="Heading4" w:type="paragraph">
     <w:name w:val="heading 4"/>
     <w:basedOn w:val="Normal"/>
-    <w:next w:val="BodyText"/>
+    <w:next w:val="Normal"/>
     <w:link w:val="Heading4Char"/>
     <w:uiPriority w:val="9"/>
     <w:semiHidden/>
     <w:unhideWhenUsed/>
     <w:qFormat/>
-    <w:rsid w:val="00A10FD9"/>
+    <w:rsid w:val="00917918"/>
     <w:pPr>
       <w:keepNext/>
       <w:keepLines/>
@@ -847,13 +1101,13 @@
   <w:style w:styleId="Heading5" w:type="paragraph">
     <w:name w:val="heading 5"/>
     <w:basedOn w:val="Normal"/>
-    <w:next w:val="BodyText"/>
+    <w:next w:val="Normal"/>
     <w:link w:val="Heading5Char"/>
     <w:uiPriority w:val="9"/>
     <w:semiHidden/>
     <w:unhideWhenUsed/>
     <w:qFormat/>
-    <w:rsid w:val="00A10FD9"/>
+    <w:rsid w:val="00917918"/>
     <w:pPr>
       <w:keepNext/>
       <w:keepLines/>
@@ -868,13 +1122,13 @@
   <w:style w:styleId="Heading6" w:type="paragraph">
     <w:name w:val="heading 6"/>
     <w:basedOn w:val="Normal"/>
-    <w:next w:val="BodyText"/>
+    <w:next w:val="Normal"/>
     <w:link w:val="Heading6Char"/>
     <w:uiPriority w:val="9"/>
     <w:semiHidden/>
     <w:unhideWhenUsed/>
     <w:qFormat/>
-    <w:rsid w:val="00A10FD9"/>
+    <w:rsid w:val="00917918"/>
     <w:pPr>
       <w:keepNext/>
       <w:keepLines/>
@@ -891,13 +1145,13 @@
   <w:style w:styleId="Heading7" w:type="paragraph">
     <w:name w:val="heading 7"/>
     <w:basedOn w:val="Normal"/>
-    <w:next w:val="BodyText"/>
+    <w:next w:val="Normal"/>
     <w:link w:val="Heading7Char"/>
     <w:uiPriority w:val="9"/>
     <w:semiHidden/>
     <w:unhideWhenUsed/>
     <w:qFormat/>
-    <w:rsid w:val="00A10FD9"/>
+    <w:rsid w:val="00917918"/>
     <w:pPr>
       <w:keepNext/>
       <w:keepLines/>
@@ -912,13 +1166,13 @@
   <w:style w:styleId="Heading8" w:type="paragraph">
     <w:name w:val="heading 8"/>
     <w:basedOn w:val="Normal"/>
-    <w:next w:val="BodyText"/>
+    <w:next w:val="Normal"/>
     <w:link w:val="Heading8Char"/>
     <w:uiPriority w:val="9"/>
     <w:semiHidden/>
     <w:unhideWhenUsed/>
     <w:qFormat/>
-    <w:rsid w:val="00A10FD9"/>
+    <w:rsid w:val="00917918"/>
     <w:pPr>
       <w:keepNext/>
       <w:keepLines/>
@@ -935,13 +1189,13 @@
   <w:style w:styleId="Heading9" w:type="paragraph">
     <w:name w:val="heading 9"/>
     <w:basedOn w:val="Normal"/>
-    <w:next w:val="BodyText"/>
+    <w:next w:val="Normal"/>
     <w:link w:val="Heading9Char"/>
     <w:uiPriority w:val="9"/>
     <w:semiHidden/>
     <w:unhideWhenUsed/>
     <w:qFormat/>
-    <w:rsid w:val="00A10FD9"/>
+    <w:rsid w:val="00917918"/>
     <w:pPr>
       <w:keepNext/>
       <w:keepLines/>
@@ -953,168 +1207,17 @@
       <w:color w:themeColor="text1" w:themeTint="D8" w:val="272727"/>
     </w:rPr>
   </w:style>
-  <w:style w:customStyle="1" w:styleId="Heading1Char" w:type="character">
-    <w:name w:val="Heading 1 Char"/>
-    <w:basedOn w:val="DefaultParagraphFont"/>
-    <w:link w:val="Heading1"/>
-    <w:uiPriority w:val="9"/>
-    <w:rsid w:val="00A10FD9"/>
-    <w:rPr>
-      <w:rFonts w:asciiTheme="majorHAnsi" w:cstheme="majorBidi" w:eastAsiaTheme="majorEastAsia" w:hAnsiTheme="majorHAnsi"/>
-      <w:color w:themeColor="accent1" w:themeShade="BF" w:val="0F4761"/>
-      <w:sz w:val="40"/>
-      <w:szCs w:val="40"/>
-    </w:rPr>
-  </w:style>
-  <w:style w:customStyle="1" w:styleId="Heading2Char" w:type="character">
-    <w:name w:val="Heading 2 Char"/>
-    <w:basedOn w:val="DefaultParagraphFont"/>
-    <w:link w:val="Heading2"/>
-    <w:uiPriority w:val="9"/>
-    <w:semiHidden/>
-    <w:rsid w:val="00A10FD9"/>
-    <w:rPr>
-      <w:rFonts w:asciiTheme="majorHAnsi" w:cstheme="majorBidi" w:eastAsiaTheme="majorEastAsia" w:hAnsiTheme="majorHAnsi"/>
-      <w:color w:themeColor="accent1" w:themeShade="BF" w:val="0F4761"/>
-      <w:sz w:val="32"/>
-      <w:szCs w:val="32"/>
-    </w:rPr>
-  </w:style>
-  <w:style w:customStyle="1" w:styleId="Heading3Char" w:type="character">
-    <w:name w:val="Heading 3 Char"/>
-    <w:basedOn w:val="DefaultParagraphFont"/>
-    <w:link w:val="Heading3"/>
-    <w:uiPriority w:val="9"/>
-    <w:semiHidden/>
-    <w:rsid w:val="00A10FD9"/>
-    <w:rPr>
-      <w:rFonts w:cstheme="majorBidi" w:eastAsiaTheme="majorEastAsia"/>
-      <w:color w:themeColor="accent1" w:themeShade="BF" w:val="0F4761"/>
-      <w:sz w:val="28"/>
-      <w:szCs w:val="28"/>
-    </w:rPr>
-  </w:style>
-  <w:style w:customStyle="1" w:styleId="Heading4Char" w:type="character">
-    <w:name w:val="Heading 4 Char"/>
-    <w:basedOn w:val="DefaultParagraphFont"/>
-    <w:link w:val="Heading4"/>
-    <w:uiPriority w:val="9"/>
-    <w:semiHidden/>
-    <w:rsid w:val="00A10FD9"/>
-    <w:rPr>
-      <w:rFonts w:cstheme="majorBidi" w:eastAsiaTheme="majorEastAsia"/>
-      <w:i/>
-      <w:iCs/>
-      <w:color w:themeColor="accent1" w:themeShade="BF" w:val="0F4761"/>
-    </w:rPr>
-  </w:style>
-  <w:style w:customStyle="1" w:styleId="Heading5Char" w:type="character">
-    <w:name w:val="Heading 5 Char"/>
-    <w:basedOn w:val="DefaultParagraphFont"/>
-    <w:link w:val="Heading5"/>
-    <w:uiPriority w:val="9"/>
-    <w:semiHidden/>
-    <w:rsid w:val="00A10FD9"/>
-    <w:rPr>
-      <w:rFonts w:cstheme="majorBidi" w:eastAsiaTheme="majorEastAsia"/>
-      <w:color w:themeColor="accent1" w:themeShade="BF" w:val="0F4761"/>
-    </w:rPr>
-  </w:style>
-  <w:style w:customStyle="1" w:styleId="Heading6Char" w:type="character">
-    <w:name w:val="Heading 6 Char"/>
-    <w:basedOn w:val="DefaultParagraphFont"/>
-    <w:link w:val="Heading6"/>
-    <w:uiPriority w:val="9"/>
-    <w:semiHidden/>
-    <w:rsid w:val="00A10FD9"/>
-    <w:rPr>
-      <w:rFonts w:cstheme="majorBidi" w:eastAsiaTheme="majorEastAsia"/>
-      <w:i/>
-      <w:iCs/>
-      <w:color w:themeColor="text1" w:themeTint="A6" w:val="595959"/>
-    </w:rPr>
-  </w:style>
-  <w:style w:customStyle="1" w:styleId="Heading7Char" w:type="character">
-    <w:name w:val="Heading 7 Char"/>
-    <w:basedOn w:val="DefaultParagraphFont"/>
-    <w:link w:val="Heading7"/>
-    <w:uiPriority w:val="9"/>
-    <w:semiHidden/>
-    <w:rsid w:val="00A10FD9"/>
-    <w:rPr>
-      <w:rFonts w:cstheme="majorBidi" w:eastAsiaTheme="majorEastAsia"/>
-      <w:color w:themeColor="text1" w:themeTint="A6" w:val="595959"/>
-    </w:rPr>
-  </w:style>
-  <w:style w:customStyle="1" w:styleId="Heading8Char" w:type="character">
-    <w:name w:val="Heading 8 Char"/>
-    <w:basedOn w:val="DefaultParagraphFont"/>
-    <w:link w:val="Heading8"/>
-    <w:uiPriority w:val="9"/>
-    <w:semiHidden/>
-    <w:rsid w:val="00A10FD9"/>
-    <w:rPr>
-      <w:rFonts w:cstheme="majorBidi" w:eastAsiaTheme="majorEastAsia"/>
-      <w:i/>
-      <w:iCs/>
-      <w:color w:themeColor="text1" w:themeTint="D8" w:val="272727"/>
-    </w:rPr>
-  </w:style>
-  <w:style w:customStyle="1" w:styleId="Heading9Char" w:type="character">
-    <w:name w:val="Heading 9 Char"/>
-    <w:basedOn w:val="DefaultParagraphFont"/>
-    <w:link w:val="Heading9"/>
-    <w:uiPriority w:val="9"/>
-    <w:semiHidden/>
-    <w:rsid w:val="00A10FD9"/>
-    <w:rPr>
-      <w:rFonts w:cstheme="majorBidi" w:eastAsiaTheme="majorEastAsia"/>
-      <w:color w:themeColor="text1" w:themeTint="D8" w:val="272727"/>
-    </w:rPr>
-  </w:style>
-  <w:style w:styleId="BlockText" w:type="paragraph">
-    <w:name w:val="Block Text"/>
-    <w:basedOn w:val="BodyText"/>
-    <w:next w:val="BodyText"/>
-    <w:uiPriority w:val="9"/>
-    <w:unhideWhenUsed/>
-    <w:qFormat/>
-    <w:pPr>
-      <w:spacing w:after="100" w:before="100"/>
-      <w:ind w:firstLine="0" w:left="480" w:right="480"/>
-    </w:pPr>
-  </w:style>
-  <w:style w:styleId="FootnoteText" w:type="paragraph">
-    <w:name w:val="Footnote Text"/>
-    <w:basedOn w:val="Normal"/>
-    <w:next w:val="FootnoteText"/>
-    <w:uiPriority w:val="9"/>
-    <w:unhideWhenUsed/>
-    <w:qFormat/>
-  </w:style>
-  <w:style w:styleId="FootnoteBlockText" w:type="paragraph">
-    <w:name w:val="Footnote Block Text"/>
-    <w:basedOn w:val="FootnoteText"/>
-    <w:next w:val="FootnoteText"/>
-    <w:uiPriority w:val="9"/>
-    <w:unhideWhenUsed/>
-    <w:qFormat/>
-    <w:pPr>
-      <w:spacing w:after="100" w:before="100"/>
-      <w:ind w:firstLine="0" w:left="480" w:right="480"/>
-    </w:pPr>
-  </w:style>
   <w:style w:default="1" w:styleId="DefaultParagraphFont" w:type="character">
     <w:name w:val="Default Paragraph Font"/>
+    <w:uiPriority w:val="1"/>
     <w:semiHidden/>
     <w:unhideWhenUsed/>
   </w:style>
-  <w:style w:default="1" w:styleId="Table" w:type="table">
-    <w:name w:val="Table"/>
-    <w:basedOn w:val="TableNormal"/>
+  <w:style w:default="1" w:styleId="TableNormal" w:type="table">
+    <w:name w:val="Normal Table"/>
+    <w:uiPriority w:val="99"/>
     <w:semiHidden/>
     <w:unhideWhenUsed/>
-    <w:qFormat/>
     <w:tblPr>
       <w:tblInd w:type="dxa" w:w="0"/>
       <w:tblCellMar>
@@ -1124,112 +1227,301 @@
         <w:right w:type="dxa" w:w="108"/>
       </w:tblCellMar>
     </w:tblPr>
-    <w:tblStylePr w:type="firstRow">
-      <w:tcPr>
-        <w:tcBorders>
-          <w:bottom w:val="single"/>
-        </w:tcBorders>
-        <w:vAlign w:val="bottom"/>
-      </w:tcPr>
-    </w:tblStylePr>
-  </w:style>
-  <w:style w:customStyle="1" w:styleId="DefinitionTerm" w:type="paragraph">
-    <w:name w:val="Definition Term"/>
+  </w:style>
+  <w:style w:default="1" w:styleId="NoList" w:type="numbering">
+    <w:name w:val="No List"/>
+    <w:uiPriority w:val="99"/>
+    <w:semiHidden/>
+    <w:unhideWhenUsed/>
+  </w:style>
+  <w:style w:customStyle="1" w:styleId="Heading1Char" w:type="character">
+    <w:name w:val="Heading 1 Char"/>
+    <w:basedOn w:val="DefaultParagraphFont"/>
+    <w:link w:val="Heading1"/>
+    <w:uiPriority w:val="9"/>
+    <w:rsid w:val="00917918"/>
+    <w:rPr>
+      <w:rFonts w:asciiTheme="majorHAnsi" w:cstheme="majorBidi" w:eastAsiaTheme="majorEastAsia" w:hAnsiTheme="majorHAnsi"/>
+      <w:color w:themeColor="accent1" w:themeShade="BF" w:val="0F4761"/>
+      <w:sz w:val="40"/>
+      <w:szCs w:val="40"/>
+    </w:rPr>
+  </w:style>
+  <w:style w:customStyle="1" w:styleId="Heading2Char" w:type="character">
+    <w:name w:val="Heading 2 Char"/>
+    <w:basedOn w:val="DefaultParagraphFont"/>
+    <w:link w:val="Heading2"/>
+    <w:uiPriority w:val="9"/>
+    <w:semiHidden/>
+    <w:rsid w:val="00917918"/>
+    <w:rPr>
+      <w:rFonts w:asciiTheme="majorHAnsi" w:cstheme="majorBidi" w:eastAsiaTheme="majorEastAsia" w:hAnsiTheme="majorHAnsi"/>
+      <w:color w:themeColor="accent1" w:themeShade="BF" w:val="0F4761"/>
+      <w:sz w:val="32"/>
+      <w:szCs w:val="32"/>
+    </w:rPr>
+  </w:style>
+  <w:style w:customStyle="1" w:styleId="Heading3Char" w:type="character">
+    <w:name w:val="Heading 3 Char"/>
+    <w:basedOn w:val="DefaultParagraphFont"/>
+    <w:link w:val="Heading3"/>
+    <w:uiPriority w:val="9"/>
+    <w:semiHidden/>
+    <w:rsid w:val="00917918"/>
+    <w:rPr>
+      <w:rFonts w:cstheme="majorBidi" w:eastAsiaTheme="majorEastAsia"/>
+      <w:color w:themeColor="accent1" w:themeShade="BF" w:val="0F4761"/>
+      <w:sz w:val="28"/>
+      <w:szCs w:val="28"/>
+    </w:rPr>
+  </w:style>
+  <w:style w:customStyle="1" w:styleId="Heading4Char" w:type="character">
+    <w:name w:val="Heading 4 Char"/>
+    <w:basedOn w:val="DefaultParagraphFont"/>
+    <w:link w:val="Heading4"/>
+    <w:uiPriority w:val="9"/>
+    <w:semiHidden/>
+    <w:rsid w:val="00917918"/>
+    <w:rPr>
+      <w:rFonts w:cstheme="majorBidi" w:eastAsiaTheme="majorEastAsia"/>
+      <w:i/>
+      <w:iCs/>
+      <w:color w:themeColor="accent1" w:themeShade="BF" w:val="0F4761"/>
+    </w:rPr>
+  </w:style>
+  <w:style w:customStyle="1" w:styleId="Heading5Char" w:type="character">
+    <w:name w:val="Heading 5 Char"/>
+    <w:basedOn w:val="DefaultParagraphFont"/>
+    <w:link w:val="Heading5"/>
+    <w:uiPriority w:val="9"/>
+    <w:semiHidden/>
+    <w:rsid w:val="00917918"/>
+    <w:rPr>
+      <w:rFonts w:cstheme="majorBidi" w:eastAsiaTheme="majorEastAsia"/>
+      <w:color w:themeColor="accent1" w:themeShade="BF" w:val="0F4761"/>
+    </w:rPr>
+  </w:style>
+  <w:style w:customStyle="1" w:styleId="Heading6Char" w:type="character">
+    <w:name w:val="Heading 6 Char"/>
+    <w:basedOn w:val="DefaultParagraphFont"/>
+    <w:link w:val="Heading6"/>
+    <w:uiPriority w:val="9"/>
+    <w:semiHidden/>
+    <w:rsid w:val="00917918"/>
+    <w:rPr>
+      <w:rFonts w:cstheme="majorBidi" w:eastAsiaTheme="majorEastAsia"/>
+      <w:i/>
+      <w:iCs/>
+      <w:color w:themeColor="text1" w:themeTint="A6" w:val="595959"/>
+    </w:rPr>
+  </w:style>
+  <w:style w:customStyle="1" w:styleId="Heading7Char" w:type="character">
+    <w:name w:val="Heading 7 Char"/>
+    <w:basedOn w:val="DefaultParagraphFont"/>
+    <w:link w:val="Heading7"/>
+    <w:uiPriority w:val="9"/>
+    <w:semiHidden/>
+    <w:rsid w:val="00917918"/>
+    <w:rPr>
+      <w:rFonts w:cstheme="majorBidi" w:eastAsiaTheme="majorEastAsia"/>
+      <w:color w:themeColor="text1" w:themeTint="A6" w:val="595959"/>
+    </w:rPr>
+  </w:style>
+  <w:style w:customStyle="1" w:styleId="Heading8Char" w:type="character">
+    <w:name w:val="Heading 8 Char"/>
+    <w:basedOn w:val="DefaultParagraphFont"/>
+    <w:link w:val="Heading8"/>
+    <w:uiPriority w:val="9"/>
+    <w:semiHidden/>
+    <w:rsid w:val="00917918"/>
+    <w:rPr>
+      <w:rFonts w:cstheme="majorBidi" w:eastAsiaTheme="majorEastAsia"/>
+      <w:i/>
+      <w:iCs/>
+      <w:color w:themeColor="text1" w:themeTint="D8" w:val="272727"/>
+    </w:rPr>
+  </w:style>
+  <w:style w:customStyle="1" w:styleId="Heading9Char" w:type="character">
+    <w:name w:val="Heading 9 Char"/>
+    <w:basedOn w:val="DefaultParagraphFont"/>
+    <w:link w:val="Heading9"/>
+    <w:uiPriority w:val="9"/>
+    <w:semiHidden/>
+    <w:rsid w:val="00917918"/>
+    <w:rPr>
+      <w:rFonts w:cstheme="majorBidi" w:eastAsiaTheme="majorEastAsia"/>
+      <w:color w:themeColor="text1" w:themeTint="D8" w:val="272727"/>
+    </w:rPr>
+  </w:style>
+  <w:style w:styleId="Title" w:type="paragraph">
+    <w:name w:val="Title"/>
     <w:basedOn w:val="Normal"/>
-    <w:next w:val="Definition"/>
+    <w:next w:val="Normal"/>
+    <w:link w:val="TitleChar"/>
+    <w:uiPriority w:val="10"/>
+    <w:qFormat/>
+    <w:rsid w:val="00917918"/>
     <w:pPr>
-      <w:keepNext/>
-      <w:keepLines/>
-      <w:spacing w:after="0"/>
+      <w:spacing w:after="80" w:line="240" w:lineRule="auto"/>
+      <w:contextualSpacing/>
     </w:pPr>
     <w:rPr>
+      <w:rFonts w:asciiTheme="majorHAnsi" w:cstheme="majorBidi" w:eastAsiaTheme="majorEastAsia" w:hAnsiTheme="majorHAnsi"/>
+      <w:spacing w:val="-10"/>
+      <w:kern w:val="28"/>
+      <w:sz w:val="56"/>
+      <w:szCs w:val="56"/>
+    </w:rPr>
+  </w:style>
+  <w:style w:customStyle="1" w:styleId="TitleChar" w:type="character">
+    <w:name w:val="Title Char"/>
+    <w:basedOn w:val="DefaultParagraphFont"/>
+    <w:link w:val="Title"/>
+    <w:uiPriority w:val="10"/>
+    <w:rsid w:val="00917918"/>
+    <w:rPr>
+      <w:rFonts w:asciiTheme="majorHAnsi" w:cstheme="majorBidi" w:eastAsiaTheme="majorEastAsia" w:hAnsiTheme="majorHAnsi"/>
+      <w:spacing w:val="-10"/>
+      <w:kern w:val="28"/>
+      <w:sz w:val="56"/>
+      <w:szCs w:val="56"/>
+    </w:rPr>
+  </w:style>
+  <w:style w:styleId="Subtitle" w:type="paragraph">
+    <w:name w:val="Subtitle"/>
+    <w:basedOn w:val="Normal"/>
+    <w:next w:val="Normal"/>
+    <w:link w:val="SubtitleChar"/>
+    <w:uiPriority w:val="11"/>
+    <w:qFormat/>
+    <w:rsid w:val="00917918"/>
+    <w:pPr>
+      <w:numPr>
+        <w:ilvl w:val="1"/>
+      </w:numPr>
+    </w:pPr>
+    <w:rPr>
+      <w:rFonts w:cstheme="majorBidi" w:eastAsiaTheme="majorEastAsia"/>
+      <w:color w:themeColor="text1" w:themeTint="A6" w:val="595959"/>
+      <w:spacing w:val="15"/>
+      <w:sz w:val="28"/>
+      <w:szCs w:val="28"/>
+    </w:rPr>
+  </w:style>
+  <w:style w:customStyle="1" w:styleId="SubtitleChar" w:type="character">
+    <w:name w:val="Subtitle Char"/>
+    <w:basedOn w:val="DefaultParagraphFont"/>
+    <w:link w:val="Subtitle"/>
+    <w:uiPriority w:val="11"/>
+    <w:rsid w:val="00917918"/>
+    <w:rPr>
+      <w:rFonts w:cstheme="majorBidi" w:eastAsiaTheme="majorEastAsia"/>
+      <w:color w:themeColor="text1" w:themeTint="A6" w:val="595959"/>
+      <w:spacing w:val="15"/>
+      <w:sz w:val="28"/>
+      <w:szCs w:val="28"/>
+    </w:rPr>
+  </w:style>
+  <w:style w:styleId="Quote" w:type="paragraph">
+    <w:name w:val="Quote"/>
+    <w:basedOn w:val="Normal"/>
+    <w:next w:val="Normal"/>
+    <w:link w:val="QuoteChar"/>
+    <w:uiPriority w:val="29"/>
+    <w:qFormat/>
+    <w:rsid w:val="00917918"/>
+    <w:pPr>
+      <w:spacing w:before="160"/>
+      <w:jc w:val="center"/>
+    </w:pPr>
+    <w:rPr>
+      <w:i/>
+      <w:iCs/>
+      <w:color w:themeColor="text1" w:themeTint="BF" w:val="404040"/>
+    </w:rPr>
+  </w:style>
+  <w:style w:customStyle="1" w:styleId="QuoteChar" w:type="character">
+    <w:name w:val="Quote Char"/>
+    <w:basedOn w:val="DefaultParagraphFont"/>
+    <w:link w:val="Quote"/>
+    <w:uiPriority w:val="29"/>
+    <w:rsid w:val="00917918"/>
+    <w:rPr>
+      <w:i/>
+      <w:iCs/>
+      <w:color w:themeColor="text1" w:themeTint="BF" w:val="404040"/>
+    </w:rPr>
+  </w:style>
+  <w:style w:styleId="ListParagraph" w:type="paragraph">
+    <w:name w:val="List Paragraph"/>
+    <w:basedOn w:val="Normal"/>
+    <w:uiPriority w:val="34"/>
+    <w:qFormat/>
+    <w:rsid w:val="00917918"/>
+    <w:pPr>
+      <w:ind w:left="720"/>
+      <w:contextualSpacing/>
+    </w:pPr>
+  </w:style>
+  <w:style w:styleId="IntenseEmphasis" w:type="character">
+    <w:name w:val="Intense Emphasis"/>
+    <w:basedOn w:val="DefaultParagraphFont"/>
+    <w:uiPriority w:val="21"/>
+    <w:qFormat/>
+    <w:rsid w:val="00917918"/>
+    <w:rPr>
+      <w:i/>
+      <w:iCs/>
+      <w:color w:themeColor="accent1" w:themeShade="BF" w:val="0F4761"/>
+    </w:rPr>
+  </w:style>
+  <w:style w:styleId="IntenseQuote" w:type="paragraph">
+    <w:name w:val="Intense Quote"/>
+    <w:basedOn w:val="Normal"/>
+    <w:next w:val="Normal"/>
+    <w:link w:val="IntenseQuoteChar"/>
+    <w:uiPriority w:val="30"/>
+    <w:qFormat/>
+    <w:rsid w:val="00917918"/>
+    <w:pPr>
+      <w:pBdr>
+        <w:top w:color="0F4761" w:space="10" w:sz="4" w:themeColor="accent1" w:themeShade="BF" w:val="single"/>
+        <w:bottom w:color="0F4761" w:space="10" w:sz="4" w:themeColor="accent1" w:themeShade="BF" w:val="single"/>
+      </w:pBdr>
+      <w:spacing w:after="360" w:before="360"/>
+      <w:ind w:left="864" w:right="864"/>
+      <w:jc w:val="center"/>
+    </w:pPr>
+    <w:rPr>
+      <w:i/>
+      <w:iCs/>
+      <w:color w:themeColor="accent1" w:themeShade="BF" w:val="0F4761"/>
+    </w:rPr>
+  </w:style>
+  <w:style w:customStyle="1" w:styleId="IntenseQuoteChar" w:type="character">
+    <w:name w:val="Intense Quote Char"/>
+    <w:basedOn w:val="DefaultParagraphFont"/>
+    <w:link w:val="IntenseQuote"/>
+    <w:uiPriority w:val="30"/>
+    <w:rsid w:val="00917918"/>
+    <w:rPr>
+      <w:i/>
+      <w:iCs/>
+      <w:color w:themeColor="accent1" w:themeShade="BF" w:val="0F4761"/>
+    </w:rPr>
+  </w:style>
+  <w:style w:styleId="IntenseReference" w:type="character">
+    <w:name w:val="Intense Reference"/>
+    <w:basedOn w:val="DefaultParagraphFont"/>
+    <w:uiPriority w:val="32"/>
+    <w:qFormat/>
+    <w:rsid w:val="00917918"/>
+    <w:rPr>
       <w:b/>
-    </w:rPr>
-  </w:style>
-  <w:style w:customStyle="1" w:styleId="Definition" w:type="paragraph">
-    <w:name w:val="Definition"/>
-    <w:basedOn w:val="Normal"/>
-  </w:style>
-  <w:style w:styleId="Caption" w:type="paragraph">
-    <w:name w:val="Caption"/>
-    <w:basedOn w:val="Normal"/>
-    <w:link w:val="BodyTextChar"/>
-    <w:pPr>
-      <w:spacing w:after="120" w:before="0"/>
-    </w:pPr>
-    <w:rPr>
-      <w:i/>
-    </w:rPr>
-  </w:style>
-  <w:style w:customStyle="1" w:styleId="TableCaption" w:type="paragraph">
-    <w:name w:val="Table Caption"/>
-    <w:basedOn w:val="Caption"/>
-    <w:pPr>
-      <w:keepNext/>
-    </w:pPr>
-  </w:style>
-  <w:style w:customStyle="1" w:styleId="ImageCaption" w:type="paragraph">
-    <w:name w:val="Image Caption"/>
-    <w:basedOn w:val="Caption"/>
-  </w:style>
-  <w:style w:customStyle="1" w:styleId="Figure" w:type="paragraph">
-    <w:name w:val="Figure"/>
-    <w:basedOn w:val="Normal"/>
-  </w:style>
-  <w:style w:customStyle="1" w:styleId="CaptionedFigure" w:type="paragraph">
-    <w:name w:val="Captioned Figure"/>
-    <w:basedOn w:val="Figure"/>
-    <w:pPr>
-      <w:keepNext/>
-    </w:pPr>
-  </w:style>
-  <w:style w:customStyle="1" w:styleId="BodyTextChar" w:type="character">
-    <w:name w:val="Body Text Char"/>
-    <w:basedOn w:val="DefaultParagraphFont"/>
-    <w:link w:val="BodyText"/>
-  </w:style>
-  <w:style w:customStyle="1" w:styleId="VerbatimChar" w:type="character">
-    <w:name w:val="Verbatim Char"/>
-    <w:basedOn w:val="BodyTextChar"/>
-    <w:rPr>
-      <w:rFonts w:ascii="Consolas" w:hAnsi="Consolas"/>
-      <w:sz w:val="22"/>
-    </w:rPr>
-  </w:style>
-  <w:style w:customStyle="1" w:styleId="SectionNumber" w:type="character">
-    <w:name w:val="Section Number"/>
-    <w:basedOn w:val="BodyTextChar"/>
-  </w:style>
-  <w:style w:styleId="FootnoteReference" w:type="character">
-    <w:name w:val="Footnote Reference"/>
-    <w:basedOn w:val="BodyTextChar"/>
-    <w:rPr>
-      <w:vertAlign w:val="superscript"/>
-    </w:rPr>
-  </w:style>
-  <w:style w:styleId="Hyperlink" w:type="character">
-    <w:name w:val="Hyperlink"/>
-    <w:basedOn w:val="BodyTextChar"/>
-    <w:rPr>
-      <w:color w:themeColor="accent1" w:val="4F81BD"/>
-    </w:rPr>
-  </w:style>
-  <w:style w:styleId="TOCHeading" w:type="paragraph">
-    <w:name w:val="TOC Heading"/>
-    <w:basedOn w:val="Heading1"/>
-    <w:next w:val="BodyText"/>
-    <w:uiPriority w:val="39"/>
-    <w:unhideWhenUsed/>
-    <w:qFormat/>
-    <w:pPr>
-      <w:spacing w:before="240" w:line="259" w:lineRule="auto"/>
-      <w:outlineLvl w:val="9"/>
-    </w:pPr>
-    <w:rPr>
-      <w:rFonts w:asciiTheme="majorHAnsi" w:cstheme="majorBidi" w:eastAsiaTheme="majorEastAsia" w:hAnsiTheme="majorHAnsi"/>
-      <w:b w:val="0"/>
-      <w:bCs w:val="0"/>
-      <w:color w:themeColor="accent1" w:themeShade="BF" w:val="365F91"/>
+      <w:bCs/>
+      <w:smallCaps/>
+      <w:color w:themeColor="accent1" w:themeShade="BF" w:val="0F4761"/>
+      <w:spacing w:val="5"/>
     </w:rPr>
   </w:style>
   <w:style w:type="paragraph" w:customStyle="1" w:styleId="SourceCode">
@@ -1711,13 +2003,6 @@
         </a:gradFill>
       </a:fillStyleLst>
       <a:lnStyleLst>
-        <a:ln w="6350" cap="flat" cmpd="sng" algn="ctr">
-          <a:solidFill>
-            <a:schemeClr val="phClr"/>
-          </a:solidFill>
-          <a:prstDash val="solid"/>
-          <a:miter lim="800000"/>
-        </a:ln>
         <a:ln w="12700" cap="flat" cmpd="sng" algn="ctr">
           <a:solidFill>
             <a:schemeClr val="phClr"/>
@@ -1726,6 +2011,13 @@
           <a:miter lim="800000"/>
         </a:ln>
         <a:ln w="19050" cap="flat" cmpd="sng" algn="ctr">
+          <a:solidFill>
+            <a:schemeClr val="phClr"/>
+          </a:solidFill>
+          <a:prstDash val="solid"/>
+          <a:miter lim="800000"/>
+        </a:ln>
+        <a:ln w="25400" cap="flat" cmpd="sng" algn="ctr">
           <a:solidFill>
             <a:schemeClr val="phClr"/>
           </a:solidFill>
@@ -1790,7 +2082,27 @@
       </a:bgFillStyleLst>
     </a:fmtScheme>
   </a:themeElements>
-  <a:objectDefaults/>
+  <a:objectDefaults>
+    <a:lnDef>
+      <a:spPr/>
+      <a:bodyPr/>
+      <a:lstStyle/>
+      <a:style>
+        <a:lnRef idx="2">
+          <a:schemeClr val="accent1"/>
+        </a:lnRef>
+        <a:fillRef idx="0">
+          <a:schemeClr val="accent1"/>
+        </a:fillRef>
+        <a:effectRef idx="1">
+          <a:schemeClr val="accent1"/>
+        </a:effectRef>
+        <a:fontRef idx="minor">
+          <a:schemeClr val="tx1"/>
+        </a:fontRef>
+      </a:style>
+    </a:lnDef>
+  </a:objectDefaults>
   <a:extraClrSchemeLst/>
   <a:extLst>
     <a:ext uri="{05A4C25C-085E-4340-85A3-A5531E510DB2}">

</xml_diff>

<commit_message>
I included a section called mutation breeding for crop improvement
</commit_message>
<xml_diff>
--- a/Mution-breeding-and-Genomic-Selection-in-Taro.docx
+++ b/Mution-breeding-and-Genomic-Selection-in-Taro.docx
@@ -7,7 +7,7 @@
         <w:pStyle w:val="Title"/>
       </w:pPr>
       <w:r>
-        <w:t xml:space="preserve">Integrating mutation breeding and genomic selection in Taro</w:t>
+        <w:t xml:space="preserve">Integrating Mutation Breeding and Genomic Selection in Taro</w:t>
       </w:r>
     </w:p>
     <w:p>
@@ -23,7 +23,7 @@
         <w:pStyle w:val="Date"/>
       </w:pPr>
       <w:r>
-        <w:t xml:space="preserve">2026-09-14</w:t>
+        <w:t xml:space="preserve">2026-10-02</w:t>
       </w:r>
     </w:p>
     <w:p>
@@ -67,16 +67,26 @@
         <w:pStyle w:val="BodyText"/>
       </w:pPr>
       <w:r>
-        <w:t xml:space="preserve">All parts of the taro are useful as food for both humans and animal. The young leaves are edible and so are the corms and cormels. Growing conditions of taro</w:t>
-      </w:r>
-    </w:p>
-    <w:bookmarkStart w:id="9" w:name="the-botany-of-taro"/>
+        <w:t xml:space="preserve">All parts of the taro are useful as food for both humans and animal. The young leaves are edible and so are the corms and cormels.</w:t>
+      </w:r>
+    </w:p>
+    <w:bookmarkStart w:id="9" w:name="growing-conditions-of-taro"/>
     <w:p>
       <w:pPr>
         <w:pStyle w:val="Heading4"/>
       </w:pPr>
       <w:r>
-        <w:t xml:space="preserve">The botany of Taro</w:t>
+        <w:t xml:space="preserve">Growing conditions of taro</w:t>
+      </w:r>
+    </w:p>
+    <w:bookmarkEnd w:id="9"/>
+    <w:bookmarkStart w:id="10" w:name="the-botany-of-taro"/>
+    <w:p>
+      <w:pPr>
+        <w:pStyle w:val="Heading4"/>
+      </w:pPr>
+      <w:r>
+        <w:t xml:space="preserve">The Botany of Taro</w:t>
       </w:r>
     </w:p>
     <w:p>
@@ -84,7 +94,44 @@
         <w:pStyle w:val="FirstParagraph"/>
       </w:pPr>
       <w:r>
-        <w:t xml:space="preserve">Taro is usually cultivated vegetatively using the corms and the cormels this is because of the firstly most taro varieties do not flower and or have produce poor seeds and secondly the onset of disease intercepts the time of flower maturation leading to the death of most of the plant hence lack of seeds available for the next planting season. this is a major bottle neck of tara improvement.</w:t>
+        <w:t xml:space="preserve">Taro is usually cultivated vegetatively using the corms and the cormels this is because of the firstly most taro varieties do not flower and or have produce poor seeds and secondly the onset of disease intercepts the time of flower maturation leading to the death of most of the plant hence lack of seeds available for the next planting season. this is a major bottle neck of taro improvement.</w:t>
+      </w:r>
+    </w:p>
+    <w:bookmarkEnd w:id="10"/>
+    <w:bookmarkStart w:id="11" w:name="genetic-variation-in-taro"/>
+    <w:p>
+      <w:pPr>
+        <w:pStyle w:val="Heading4"/>
+      </w:pPr>
+      <w:r>
+        <w:t xml:space="preserve">Genetic Variation in Taro</w:t>
+      </w:r>
+    </w:p>
+    <w:bookmarkEnd w:id="11"/>
+    <w:bookmarkStart w:id="15" w:name="what-is-mutation"/>
+    <w:p>
+      <w:pPr>
+        <w:pStyle w:val="Heading4"/>
+      </w:pPr>
+      <w:r>
+        <w:t xml:space="preserve">What is Mutation</w:t>
+      </w:r>
+    </w:p>
+    <w:p>
+      <w:pPr>
+        <w:pStyle w:val="FirstParagraph"/>
+      </w:pPr>
+      <w:r>
+        <w:t xml:space="preserve">Mutation is a change in the nucleotide sequence of a short region of a genome. Mutation occurs either due to error in the DNA replication or from the effect of mutagens such as chemicals, heat and irradiation leading to structural changes n the DNA. The change usually affect on one strand of the parent double helix. that is only one strand carries the mutation</w:t>
+      </w:r>
+      <w:r>
+        <w:t xml:space="preserve"> </w:t>
+      </w:r>
+      <w:r>
+        <w:t xml:space="preserve">(Brown 2002)</w:t>
+      </w:r>
+      <w:r>
+        <w:t xml:space="preserve">.</w:t>
       </w:r>
     </w:p>
     <w:p>
@@ -92,34 +139,7 @@
         <w:pStyle w:val="BodyText"/>
       </w:pPr>
       <w:r>
-        <w:t xml:space="preserve">Taro breeders are seeking for ways to overcome the problem of seed availability and have employed method such as staggering the planting time to escape disease the peak of disease outbreak. Mutation breeding is one method that breeders can employ to increase genetic diversity of taro. there is need to understand what mutation is before we think of mutation breeding</w:t>
-      </w:r>
-    </w:p>
-    <w:bookmarkEnd w:id="9"/>
-    <w:bookmarkStart w:id="13" w:name="what-is-mutation"/>
-    <w:p>
-      <w:pPr>
-        <w:pStyle w:val="Heading4"/>
-      </w:pPr>
-      <w:r>
-        <w:t xml:space="preserve">What is Mutation</w:t>
-      </w:r>
-    </w:p>
-    <w:p>
-      <w:pPr>
-        <w:pStyle w:val="FirstParagraph"/>
-      </w:pPr>
-      <w:r>
-        <w:t xml:space="preserve">Mutation is a change in the nucleotide sequence of a short region of a genome. Mutation occurs either due to error in the DNA replication or from the effect of mutagens such as chemicals, heat and irradiation leading to structural changes n the DNA. The change usually affect on one strand of the parent double helix. that is only one strand carries the mutation</w:t>
-      </w:r>
-      <w:r>
-        <w:t xml:space="preserve"> </w:t>
-      </w:r>
-      <w:r>
-        <w:t xml:space="preserve">(Brown 2002)</w:t>
-      </w:r>
-      <w:r>
-        <w:t xml:space="preserve">.</w:t>
+        <w:t xml:space="preserve">Mutation can be classified based on the scale of the DNA sequence affected by the mutational events. mutation can be either small or large scale.</w:t>
       </w:r>
     </w:p>
     <w:p>
@@ -127,7 +147,7 @@
         <w:pStyle w:val="BodyText"/>
       </w:pPr>
       <w:r>
-        <w:t xml:space="preserve">Mutation can be classified based on the scale of the DNA sequence affected by the mutational events. mutaion can be either small or large scale.</w:t>
+        <w:t xml:space="preserve">Small scale mutation involves changes in one or few nucleotides. Small scale mutation includes deletion, insertion and substitution of one or few nucleotides. Substitution is also called point mutation - and it is when one nucleotide is replaces with another nucleotide.</w:t>
       </w:r>
     </w:p>
     <w:p>
@@ -135,7 +155,7 @@
         <w:pStyle w:val="BodyText"/>
       </w:pPr>
       <w:r>
-        <w:t xml:space="preserve">Small scale mutation involves changes in one or few nucleotides. Small scale mutation includes deletion, insertion and substitution of one or few nucleotides. Substitution is also called point mutation - and it is when one nucleotide is replaces with another nucleotide. Point mutation occurs in two way; transition - when a purine is converted to a purine and vice versa. Transversion is when a purine is converted to a pyrimidine and vice versa. Point mutation is of three types, silence mutation, missence mutation and nonsense mutation. Silence mutation occurs when the change in nucleotide of a codon leads to the formation of a new codon that translates into the same amino acid. Mis-sense mutation occurs when the codon is changed into another codon that translates into a different amino acid, and non-sense mutation occurs when the codon is changed into a codon that does not translate any amino acid. The resulting codon (the stop codon) of a non-sense mutation leads to the end of the a translation process.</w:t>
+        <w:t xml:space="preserve">Point mutation occurs in two way; transition and transversion. Translation occurs when a purine is converted to a purine and vice versa. Transversion occurs when a purine is converted to a pyrimidine and vice versa.</w:t>
       </w:r>
     </w:p>
     <w:p>
@@ -143,7 +163,15 @@
         <w:pStyle w:val="BodyText"/>
       </w:pPr>
       <w:r>
-        <w:t xml:space="preserve">Large scale mutation affects the entire structure of the chromosome. Large scale mutation involves deletion of a large region of the chromosome leading to loss of genes, and duplication of a single chromosome. Duplication can lead to extra copies of genes, and inversion is when the segment of the chromosome is reversed. Large scale mutation can occur also include insertion of an extra copy of a chromosome, and translocation of sections of the DNA from one location to another location.</w:t>
+        <w:t xml:space="preserve">Point mutation is of three types, silence mutation, mis-sence mutation and nonsense mutation. Silence mutation occurs when the change in nucleotide of a codon leads to the formation of a new codon that translates into the same amino acid. Mis-sense mutation occurs when the codon is changed into another codon that translates into a different amino acid, and non-sense mutation occurs when the codon is changed into a codon that does not translate any amino acid. The resulting codon (the stop codon) of a non-sense mutation leads to the end of the a translation process.</w:t>
+      </w:r>
+    </w:p>
+    <w:p>
+      <w:pPr>
+        <w:pStyle w:val="BodyText"/>
+      </w:pPr>
+      <w:r>
+        <w:t xml:space="preserve">Large scale mutation affects the entire structure of the chromosome. Large scale mutation involves deletion, duplication, and inversion. Deletion of a large region of the chromosome can lead to loss of genes. Duplication can lead to extra copies of genes. Inversion is when the segment of the chromosome is reversed. Large scale mutation can occur also include insertion of an extra copy of a chromosome, and translocation of sections of the DNA from one location to another location.</w:t>
       </w:r>
     </w:p>
     <w:p>
@@ -155,18 +183,18 @@
           <wp:inline>
             <wp:extent cx="5943600" cy="3587699"/>
             <wp:effectExtent b="0" l="0" r="0" t="0"/>
-            <wp:docPr descr="" title="" id="11" name="Picture"/>
+            <wp:docPr descr="" title="" id="13" name="Picture"/>
             <a:graphic>
               <a:graphicData uri="http://schemas.openxmlformats.org/drawingml/2006/picture">
                 <pic:pic>
                   <pic:nvPicPr>
-                    <pic:cNvPr descr="Mution-breeding-and-Genomic-Selection-in-Taro_files/images/clipboard-3780650227.png" id="12" name="Picture"/>
+                    <pic:cNvPr descr="Mution-breeding-and-Genomic-Selection-in-Taro_files/images/clipboard-3780650227.png" id="14" name="Picture"/>
                     <pic:cNvPicPr>
                       <a:picLocks noChangeArrowheads="1" noChangeAspect="1"/>
                     </pic:cNvPicPr>
                   </pic:nvPicPr>
                   <pic:blipFill>
-                    <a:blip r:embed="rId10"/>
+                    <a:blip r:embed="rId12"/>
                     <a:stretch>
                       <a:fillRect/>
                     </a:stretch>
@@ -206,31 +234,50 @@
         <w:pStyle w:val="BodyText"/>
       </w:pPr>
       <w:r>
-        <w:t xml:space="preserve">Mutation is the main source of all genetic variation that occurs in organisms including plants (Kharkwal 2011). these variation are the source of raw materials needed for natural selection to operate and ring about evolution (Kharkwal 2011)</w:t>
+        <w:t xml:space="preserve">Mutation is the main source of all genetic variation that occurs in organisms including plants (Kharkwal 2011). these variation are the source of raw materials needed for natural selection to operate and ring about evolution (Kharkwal 2011) Mutation can be spontaneous. This is when mutation occurs naturally in a population resulting in new phenotype or variation in the population(). spontaneous mutation naturally occurs during adaptation and evolution processes. Mutation can also be deliberately induced to occur.</w:t>
+      </w:r>
+    </w:p>
+    <w:bookmarkEnd w:id="15"/>
+    <w:bookmarkStart w:id="19" w:name="mutagens-what-are-they"/>
+    <w:p>
+      <w:pPr>
+        <w:pStyle w:val="Heading4"/>
+      </w:pPr>
+      <w:r>
+        <w:t xml:space="preserve">Mutagens what are they?</w:t>
+      </w:r>
+    </w:p>
+    <w:p>
+      <w:pPr>
+        <w:pStyle w:val="FirstParagraph"/>
+      </w:pPr>
+      <w:r>
+        <w:t xml:space="preserve">Mutation involves the use of mutagen. Mutagens are substances or agents that changes the genetic material of an organism</w:t>
       </w:r>
       <w:r>
         <w:t xml:space="preserve"> </w:t>
       </w:r>
       <w:r>
-        <w:t xml:space="preserve">Mutation can be spontaneous. This is when mutation occurs naturally in a population resulting in new phenotype or variation in the population(). spontaneous mutation naturally occurs during adaptation and evolution processes. Mutation can also be deliberately induced to occur.</w:t>
-      </w:r>
-    </w:p>
-    <w:bookmarkEnd w:id="13"/>
-    <w:bookmarkStart w:id="25" w:name="mutagens"/>
-    <w:p>
-      <w:pPr>
-        <w:pStyle w:val="Heading3"/>
-      </w:pPr>
-      <w:r>
-        <w:t xml:space="preserve">Mutagens</w:t>
-      </w:r>
-    </w:p>
-    <w:p>
-      <w:pPr>
-        <w:pStyle w:val="FirstParagraph"/>
-      </w:pPr>
-      <w:r>
-        <w:t xml:space="preserve">Mutation involves the use of physical mutagens like ionized radiation such as x-rays, gammar rays and fast neutron. These radiations alter the DNA structure of plants. Mutation also involves the use of chemical mutagens such ethyl ethyl methanesulfonate (EMS) to induce spontaneous genetic variation in plant to develop new crop varieties</w:t>
+        <w:t xml:space="preserve">(Harding 2024)</w:t>
+      </w:r>
+      <w:r>
+        <w:t xml:space="preserve">. Mutagens can be physical, chemical and biological ().</w:t>
+      </w:r>
+    </w:p>
+    <w:p>
+      <w:pPr>
+        <w:pStyle w:val="BodyText"/>
+      </w:pPr>
+      <w:r>
+        <w:t xml:space="preserve">Physical mutagens can be classified into agents with ionizing and non-ionizing radiation. Ionizing radiation is divided into the particulate radiation such as alpha rays and the non-particulate radiation such as X-rays and gamma rays (). Non-ionizing radiation include Ultraviolent light</w:t>
+      </w:r>
+    </w:p>
+    <w:p>
+      <w:pPr>
+        <w:pStyle w:val="BodyText"/>
+      </w:pPr>
+      <w:r>
+        <w:t xml:space="preserve">Mutation also involves the use of chemical mutagens such ethyl ethyl methanesulfonate (EMS) to induce spontaneous genetic variation in plant to develop new crop varieties</w:t>
       </w:r>
       <w:r>
         <w:t xml:space="preserve"> </w:t>
@@ -242,105 +289,176 @@
         <w:t xml:space="preserve"> </w:t>
       </w:r>
       <w:r>
-        <w:t xml:space="preserve">one of the advantages of mutation breeding is that it increases the genetic diversity.</w:t>
-      </w:r>
-      <w:r>
-        <w:t xml:space="preserve"> </w:t>
-      </w:r>
-      <w:r>
-        <w:t xml:space="preserve">Mutation can also be induced using biotechnological processes (Kharkwal 2011)</w:t>
-      </w:r>
-    </w:p>
-    <w:bookmarkStart w:id="14" w:name="mutation-breeding-for-crop-improvement"/>
-    <w:p>
-      <w:pPr>
-        <w:pStyle w:val="Heading4"/>
-      </w:pPr>
-      <w:r>
-        <w:t xml:space="preserve">Mutation breeding for crop improvement</w:t>
-      </w:r>
-    </w:p>
-    <w:p>
-      <w:pPr>
-        <w:pStyle w:val="FirstParagraph"/>
-      </w:pPr>
-      <w:r>
-        <w:t xml:space="preserve">Crop improvements can be made when sufficient variation for a given trait of interest is available within the gene pool of the crop. In many cases, the desired variation may exist in out-dated varieties, old landraces (Forstera and Shu 2011). to harness these desired variations from the elite varieties or landraces into the new lines will involve long breeding process which might be less appealing to the plant breeder. A much better approach is to cause variation in the new lines without undergoing so several crosses and selection. Mutation breeding is one method that can create variation without involving crossing.</w:t>
+        <w:t xml:space="preserve">one of the advantages of mutation breeding is that it increases the genetic diversity. Mutation can also be induced using biotechnological processes (Kharkwal 2011)</w:t>
       </w:r>
     </w:p>
     <w:p>
       <w:pPr>
         <w:pStyle w:val="BodyText"/>
-      </w:pPr>
-      <w:r>
-        <w:t xml:space="preserve">Freisleben and Lein (1944) first defined the term mutation breeding as the deliberate induction and development of mutant lines for crop improvement (Forstera and Shu 2011). Mutation breeding is a processes of creating variation in plant by intentionally inducing mutations and utilize them for crop improvement.</w:t>
-      </w:r>
-    </w:p>
-    <w:p>
-      <w:pPr>
-        <w:pStyle w:val="BodyText"/>
-      </w:pPr>
-      <w:r>
-        <w:t xml:space="preserve">Genetic diversity is important to plant breeders because it allows for the selection of new traits. Although mutants can be produced using different mutagens, mutation breeding is restricted to the use of physical and chemical mutagens (Forstera and Shu 2011).</w:t>
-      </w:r>
-    </w:p>
-    <w:p>
-      <w:pPr>
-        <w:pStyle w:val="BodyText"/>
-      </w:pPr>
-      <w:r>
-        <w:t xml:space="preserve">Mutation breeding can be useful in plants with narrow genetic base like taro.</w:t>
-      </w:r>
-    </w:p>
-    <w:bookmarkEnd w:id="14"/>
-    <w:bookmarkStart w:id="15" w:name="Xfb671e7d8b340cf9eca7793602245abea5c68ee"/>
-    <w:p>
-      <w:pPr>
-        <w:pStyle w:val="Heading4"/>
-      </w:pPr>
-      <w:r>
-        <w:t xml:space="preserve">Principles and application of mutation breeding</w:t>
-      </w:r>
-    </w:p>
-    <w:p>
-      <w:pPr>
-        <w:pStyle w:val="FirstParagraph"/>
-      </w:pPr>
-      <w:r>
-        <w:t xml:space="preserve">Induce mutation caused either due to physical or chemical mutagens occur at random across the genome or within any locus or gene ()</w:t>
-      </w:r>
-    </w:p>
-    <w:bookmarkEnd w:id="15"/>
-    <w:bookmarkStart w:id="24" w:name="X53bfa4b6802512ded6a17f04feab927a2cce647"/>
-    <w:p>
-      <w:pPr>
-        <w:pStyle w:val="Heading4"/>
-      </w:pPr>
-      <w:r>
-        <w:t xml:space="preserve">Genomic selection and mutation breeding workflow</w:t>
-      </w:r>
-    </w:p>
-    <w:p>
-      <w:pPr>
-        <w:pStyle w:val="FirstParagraph"/>
       </w:pPr>
       <w:r>
         <w:drawing>
           <wp:inline>
-            <wp:extent cx="5943600" cy="6324850"/>
+            <wp:extent cx="5943600" cy="2692400"/>
             <wp:effectExtent b="0" l="0" r="0" t="0"/>
             <wp:docPr descr="" title="" id="17" name="Picture"/>
             <a:graphic>
               <a:graphicData uri="http://schemas.openxmlformats.org/drawingml/2006/picture">
                 <pic:pic>
                   <pic:nvPicPr>
-                    <pic:cNvPr descr="Mution-breeding-and-Genomic-Selection-in-Taro_files/images/mutation breeding 2-01.png" id="18" name="Picture"/>
+                    <pic:cNvPr descr="Mution-breeding-and-Genomic-Selection-in-Taro_files/images/clipboard-3635003267.png" id="18" name="Picture"/>
                     <pic:cNvPicPr>
                       <a:picLocks noChangeArrowheads="1" noChangeAspect="1"/>
                     </pic:cNvPicPr>
                   </pic:nvPicPr>
                   <pic:blipFill>
                     <a:blip r:embed="rId16"/>
+                    <a:stretch>
+                      <a:fillRect/>
+                    </a:stretch>
+                  </pic:blipFill>
+                  <pic:spPr bwMode="auto">
+                    <a:xfrm>
+                      <a:off x="0" y="0"/>
+                      <a:ext cx="5943600" cy="2692400"/>
+                    </a:xfrm>
+                    <a:prstGeom prst="rect">
+                      <a:avLst/>
+                    </a:prstGeom>
+                    <a:noFill/>
+                    <a:ln w="9525">
+                      <a:noFill/>
+                      <a:headEnd/>
+                      <a:tailEnd/>
+                    </a:ln>
+                  </pic:spPr>
+                </pic:pic>
+              </a:graphicData>
+            </a:graphic>
+          </wp:inline>
+        </w:drawing>
+      </w:r>
+    </w:p>
+    <w:bookmarkEnd w:id="19"/>
+    <w:bookmarkStart w:id="20" w:name="mutation-breeding-for-crop-improvement"/>
+    <w:p>
+      <w:pPr>
+        <w:pStyle w:val="Heading4"/>
+      </w:pPr>
+      <w:r>
+        <w:t xml:space="preserve">Mutation breeding for crop improvement</w:t>
+      </w:r>
+    </w:p>
+    <w:p>
+      <w:pPr>
+        <w:pStyle w:val="FirstParagraph"/>
+      </w:pPr>
+      <w:r>
+        <w:t xml:space="preserve">Crop improvements can be made when sufficient variation for a given trait of interest is available within the gene pool of the crop. In many cases, the desired variation may exist in out-dated varieties, old landraces (Forstera and Shu 2011). to harness these desired variations from the elite varieties or landraces into the new lines will involve long breeding process which might be less appealing to the plant breeder. A much better approach is to cause variation in the new lines without undergoing so several crosses and selection. Mutation breeding is one method that can create variation without involving crossing.</w:t>
+      </w:r>
+    </w:p>
+    <w:p>
+      <w:pPr>
+        <w:pStyle w:val="BodyText"/>
+      </w:pPr>
+      <w:r>
+        <w:t xml:space="preserve">Freisleben and Lein (1944) first defined the term mutation breeding as the deliberate induction and development of mutant lines for crop improvement (Forstera and Shu 2011). Mutation breeding is a processes of creating variation in plant by intentionally inducing mutations and utilize them for crop improvement.</w:t>
+      </w:r>
+    </w:p>
+    <w:p>
+      <w:pPr>
+        <w:pStyle w:val="BodyText"/>
+      </w:pPr>
+      <w:r>
+        <w:t xml:space="preserve">Genetic diversity is important to plant breeders because it allows for the selection of new traits. Although mutants can be produced using different mutagens, mutation breeding is restricted to the use of physical and chemical mutagens (Forstera and Shu 2011).</w:t>
+      </w:r>
+    </w:p>
+    <w:p>
+      <w:pPr>
+        <w:pStyle w:val="BodyText"/>
+      </w:pPr>
+      <w:r>
+        <w:t xml:space="preserve">Mutation breeding can be useful in plants with narrow genetic base like taro. Taro breeders are seeking for ways to overcome the problem of seed availability and have employed method such as staggering the planting time to escape disease the peak of disease outbreak. Mutation breeding is one method that breeders can employ to increase genetic diversity of taro. There is need to understand what mutation is before we think of mutation breeding</w:t>
+      </w:r>
+    </w:p>
+    <w:bookmarkEnd w:id="20"/>
+    <w:bookmarkStart w:id="21" w:name="Xfb671e7d8b340cf9eca7793602245abea5c68ee"/>
+    <w:p>
+      <w:pPr>
+        <w:pStyle w:val="Heading4"/>
+      </w:pPr>
+      <w:r>
+        <w:t xml:space="preserve">Principles and application of mutation breeding</w:t>
+      </w:r>
+    </w:p>
+    <w:bookmarkEnd w:id="21"/>
+    <w:bookmarkStart w:id="22" w:name="problems-of-mutation-breeding"/>
+    <w:p>
+      <w:pPr>
+        <w:pStyle w:val="Heading4"/>
+      </w:pPr>
+      <w:r>
+        <w:t xml:space="preserve">Problems of Mutation Breeding</w:t>
+      </w:r>
+    </w:p>
+    <w:p>
+      <w:pPr>
+        <w:pStyle w:val="FirstParagraph"/>
+      </w:pPr>
+      <w:r>
+        <w:t xml:space="preserve">Althogh mutation breeding creates diverisy and increases genetic base, it is not left with some negative effects. Mutation breeding is random and unpredictable which result to the development of crops with high proportion of deleterious or neutral traits along side crops with the desired traits</w:t>
+      </w:r>
+      <w:r>
+        <w:t xml:space="preserve"> </w:t>
+      </w:r>
+      <w:r>
+        <w:t xml:space="preserve">Mutanda et al. (2025)</w:t>
+      </w:r>
+      <w:r>
+        <w:t xml:space="preserve">. Because many random traits are produced using mutation breeding, more time and resources are channeled into screening of the large mutant population (Shahwar et al 2023)</w:t>
+      </w:r>
+    </w:p>
+    <w:bookmarkEnd w:id="22"/>
+    <w:bookmarkStart w:id="23" w:name="mutation-breeding-in-taro"/>
+    <w:p>
+      <w:pPr>
+        <w:pStyle w:val="Heading4"/>
+      </w:pPr>
+      <w:r>
+        <w:t xml:space="preserve">Mutation Breeding in Taro</w:t>
+      </w:r>
+    </w:p>
+    <w:bookmarkEnd w:id="23"/>
+    <w:bookmarkStart w:id="36" w:name="X53bfa4b6802512ded6a17f04feab927a2cce647"/>
+    <w:p>
+      <w:pPr>
+        <w:pStyle w:val="Heading4"/>
+      </w:pPr>
+      <w:r>
+        <w:t xml:space="preserve">Genomic selection and mutation breeding workflow</w:t>
+      </w:r>
+    </w:p>
+    <w:p>
+      <w:pPr>
+        <w:pStyle w:val="FirstParagraph"/>
+      </w:pPr>
+      <w:r>
+        <w:drawing>
+          <wp:inline>
+            <wp:extent cx="5943600" cy="6324850"/>
+            <wp:effectExtent b="0" l="0" r="0" t="0"/>
+            <wp:docPr descr="" title="" id="25" name="Picture"/>
+            <a:graphic>
+              <a:graphicData uri="http://schemas.openxmlformats.org/drawingml/2006/picture">
+                <pic:pic>
+                  <pic:nvPicPr>
+                    <pic:cNvPr descr="Mution-breeding-and-Genomic-Selection-in-Taro_files/images/mutation breeding 2-01.png" id="26" name="Picture"/>
+                    <pic:cNvPicPr>
+                      <a:picLocks noChangeArrowheads="1" noChangeAspect="1"/>
+                    </pic:cNvPicPr>
+                  </pic:nvPicPr>
+                  <pic:blipFill>
+                    <a:blip r:embed="rId24"/>
                     <a:stretch>
                       <a:fillRect/>
                     </a:stretch>
@@ -366,6 +484,12 @@
           </wp:inline>
         </w:drawing>
       </w:r>
+      <w:r>
+        <w:t xml:space="preserve"> </w:t>
+      </w:r>
+      <w:r>
+        <w:t xml:space="preserve">#### Conclusion</w:t>
+      </w:r>
     </w:p>
     <w:p>
       <w:pPr>
@@ -403,8 +527,16 @@
         <w:t xml:space="preserve">Kharkwal M.C. 2011 A Brief History of Plant Mutagenesis in Shu Q.Y., Forster B.P., and Nakagawa H. edited Plant Mutation Breeding and Biotechnology. Plant Breeding and Genetics Section Joint FAO/IAEA Division of Nuclear Techniques in Food and Agriculture International Atomic Energy Agency, Vienna, Austria</w:t>
       </w:r>
     </w:p>
-    <w:bookmarkStart w:id="23" w:name="refs"/>
-    <w:bookmarkStart w:id="20" w:name="ref-brown2002"/>
+    <w:p>
+      <w:pPr>
+        <w:pStyle w:val="BodyText"/>
+      </w:pPr>
+      <w:r>
+        <w:t xml:space="preserve">Shahwar, D., Ahn, N., Kim, D., Ahn, W., and Park, Y. (2023). Mutagenesis-based plant breeding approaches and genome engineering: a review focused on tomato. Mut. Res. Rev. Mut. Res. 792:108473. doi: 10.1016/j.mrrev.2023.108473</w:t>
+      </w:r>
+    </w:p>
+    <w:bookmarkStart w:id="35" w:name="refs"/>
+    <w:bookmarkStart w:id="28" w:name="ref-brown2002"/>
     <w:p>
       <w:pPr>
         <w:pStyle w:val="Bibliography"/>
@@ -428,7 +560,7 @@
       <w:r>
         <w:t xml:space="preserve"> </w:t>
       </w:r>
-      <w:hyperlink r:id="rId19">
+      <w:hyperlink r:id="rId27">
         <w:r>
           <w:rPr>
             <w:rStyle w:val="Hyperlink"/>
@@ -440,8 +572,8 @@
         <w:t xml:space="preserve">.</w:t>
       </w:r>
     </w:p>
-    <w:bookmarkEnd w:id="20"/>
-    <w:bookmarkStart w:id="22" w:name="ref-cvejic2026"/>
+    <w:bookmarkEnd w:id="28"/>
+    <w:bookmarkStart w:id="30" w:name="ref-cvejic2026"/>
     <w:p>
       <w:pPr>
         <w:pStyle w:val="Bibliography"/>
@@ -474,7 +606,7 @@
       <w:r>
         <w:t xml:space="preserve"> </w:t>
       </w:r>
-      <w:hyperlink r:id="rId21">
+      <w:hyperlink r:id="rId29">
         <w:r>
           <w:rPr>
             <w:rStyle w:val="Hyperlink"/>
@@ -486,10 +618,101 @@
         <w:t xml:space="preserve">.</w:t>
       </w:r>
     </w:p>
-    <w:bookmarkEnd w:id="22"/>
-    <w:bookmarkEnd w:id="23"/>
-    <w:bookmarkEnd w:id="24"/>
-    <w:bookmarkEnd w:id="25"/>
+    <w:bookmarkEnd w:id="30"/>
+    <w:bookmarkStart w:id="32" w:name="ref-harding2024"/>
+    <w:p>
+      <w:pPr>
+        <w:pStyle w:val="Bibliography"/>
+      </w:pPr>
+      <w:r>
+        <w:t xml:space="preserve">Harding, Oliva. 2024.</w:t>
+      </w:r>
+      <w:r>
+        <w:t xml:space="preserve"> </w:t>
+      </w:r>
+      <w:r>
+        <w:t xml:space="preserve">“Mutagens and Their Role in Genetic Transformation.”</w:t>
+      </w:r>
+      <w:r>
+        <w:t xml:space="preserve"> </w:t>
+      </w:r>
+      <w:r>
+        <w:rPr>
+          <w:i/>
+          <w:iCs/>
+        </w:rPr>
+        <w:t xml:space="preserve">Advancements in Genetic Engineering</w:t>
+      </w:r>
+      <w:r>
+        <w:t xml:space="preserve"> </w:t>
+      </w:r>
+      <w:r>
+        <w:t xml:space="preserve">13 (6): 1–2.</w:t>
+      </w:r>
+      <w:r>
+        <w:t xml:space="preserve"> </w:t>
+      </w:r>
+      <w:hyperlink r:id="rId31">
+        <w:r>
+          <w:rPr>
+            <w:rStyle w:val="Hyperlink"/>
+          </w:rPr>
+          <w:t xml:space="preserve">https://doi.org/10.35841/2169-0111.24.13.308</w:t>
+        </w:r>
+      </w:hyperlink>
+      <w:r>
+        <w:t xml:space="preserve">.</w:t>
+      </w:r>
+    </w:p>
+    <w:bookmarkEnd w:id="32"/>
+    <w:bookmarkStart w:id="34" w:name="ref-mutanda2025"/>
+    <w:p>
+      <w:pPr>
+        <w:pStyle w:val="Bibliography"/>
+      </w:pPr>
+      <w:r>
+        <w:t xml:space="preserve">Mutanda, Maltase, Sandiswa Figlan, Nemera G. Shargie, and Eastonce T. Gwata. 2025.</w:t>
+      </w:r>
+      <w:r>
+        <w:t xml:space="preserve"> </w:t>
+      </w:r>
+      <w:r>
+        <w:t xml:space="preserve">“Mutation Breeding: An Underutilized Strategy for Improving Finger Millet Productivity and Nutritional Quality.”</w:t>
+      </w:r>
+      <w:r>
+        <w:t xml:space="preserve"> </w:t>
+      </w:r>
+      <w:r>
+        <w:rPr>
+          <w:i/>
+          <w:iCs/>
+        </w:rPr>
+        <w:t xml:space="preserve">Frontiers in Sustainable Food Systems</w:t>
+      </w:r>
+      <w:r>
+        <w:t xml:space="preserve"> </w:t>
+      </w:r>
+      <w:r>
+        <w:t xml:space="preserve">9 (October).</w:t>
+      </w:r>
+      <w:r>
+        <w:t xml:space="preserve"> </w:t>
+      </w:r>
+      <w:hyperlink r:id="rId33">
+        <w:r>
+          <w:rPr>
+            <w:rStyle w:val="Hyperlink"/>
+          </w:rPr>
+          <w:t xml:space="preserve">https://doi.org/10.3389/fsufs.2025.1679819</w:t>
+        </w:r>
+      </w:hyperlink>
+      <w:r>
+        <w:t xml:space="preserve">.</w:t>
+      </w:r>
+    </w:p>
+    <w:bookmarkEnd w:id="34"/>
+    <w:bookmarkEnd w:id="35"/>
+    <w:bookmarkEnd w:id="36"/>
     <w:sectPr>
       <w:pgSz w:h="15840" w:w="12240"/>
       <w:pgMar w:bottom="1440" w:footer="720" w:gutter="0" w:header="720" w:left="1440" w:right="1440" w:top="1440"/>
@@ -1015,7 +1238,7 @@
     <w:link w:val="Heading1Char"/>
     <w:uiPriority w:val="9"/>
     <w:qFormat/>
-    <w:rsid w:val="00917918"/>
+    <w:rsid w:val="006E1922"/>
     <w:pPr>
       <w:keepNext/>
       <w:keepLines/>
@@ -1038,7 +1261,7 @@
     <w:semiHidden/>
     <w:unhideWhenUsed/>
     <w:qFormat/>
-    <w:rsid w:val="00917918"/>
+    <w:rsid w:val="006E1922"/>
     <w:pPr>
       <w:keepNext/>
       <w:keepLines/>
@@ -1061,7 +1284,7 @@
     <w:semiHidden/>
     <w:unhideWhenUsed/>
     <w:qFormat/>
-    <w:rsid w:val="00917918"/>
+    <w:rsid w:val="006E1922"/>
     <w:pPr>
       <w:keepNext/>
       <w:keepLines/>
@@ -1084,7 +1307,7 @@
     <w:semiHidden/>
     <w:unhideWhenUsed/>
     <w:qFormat/>
-    <w:rsid w:val="00917918"/>
+    <w:rsid w:val="006E1922"/>
     <w:pPr>
       <w:keepNext/>
       <w:keepLines/>
@@ -1107,7 +1330,7 @@
     <w:semiHidden/>
     <w:unhideWhenUsed/>
     <w:qFormat/>
-    <w:rsid w:val="00917918"/>
+    <w:rsid w:val="006E1922"/>
     <w:pPr>
       <w:keepNext/>
       <w:keepLines/>
@@ -1128,7 +1351,7 @@
     <w:semiHidden/>
     <w:unhideWhenUsed/>
     <w:qFormat/>
-    <w:rsid w:val="00917918"/>
+    <w:rsid w:val="006E1922"/>
     <w:pPr>
       <w:keepNext/>
       <w:keepLines/>
@@ -1151,7 +1374,7 @@
     <w:semiHidden/>
     <w:unhideWhenUsed/>
     <w:qFormat/>
-    <w:rsid w:val="00917918"/>
+    <w:rsid w:val="006E1922"/>
     <w:pPr>
       <w:keepNext/>
       <w:keepLines/>
@@ -1172,7 +1395,7 @@
     <w:semiHidden/>
     <w:unhideWhenUsed/>
     <w:qFormat/>
-    <w:rsid w:val="00917918"/>
+    <w:rsid w:val="006E1922"/>
     <w:pPr>
       <w:keepNext/>
       <w:keepLines/>
@@ -1195,7 +1418,7 @@
     <w:semiHidden/>
     <w:unhideWhenUsed/>
     <w:qFormat/>
-    <w:rsid w:val="00917918"/>
+    <w:rsid w:val="006E1922"/>
     <w:pPr>
       <w:keepNext/>
       <w:keepLines/>
@@ -1239,7 +1462,7 @@
     <w:basedOn w:val="DefaultParagraphFont"/>
     <w:link w:val="Heading1"/>
     <w:uiPriority w:val="9"/>
-    <w:rsid w:val="00917918"/>
+    <w:rsid w:val="006E1922"/>
     <w:rPr>
       <w:rFonts w:asciiTheme="majorHAnsi" w:cstheme="majorBidi" w:eastAsiaTheme="majorEastAsia" w:hAnsiTheme="majorHAnsi"/>
       <w:color w:themeColor="accent1" w:themeShade="BF" w:val="0F4761"/>
@@ -1253,7 +1476,7 @@
     <w:link w:val="Heading2"/>
     <w:uiPriority w:val="9"/>
     <w:semiHidden/>
-    <w:rsid w:val="00917918"/>
+    <w:rsid w:val="006E1922"/>
     <w:rPr>
       <w:rFonts w:asciiTheme="majorHAnsi" w:cstheme="majorBidi" w:eastAsiaTheme="majorEastAsia" w:hAnsiTheme="majorHAnsi"/>
       <w:color w:themeColor="accent1" w:themeShade="BF" w:val="0F4761"/>
@@ -1267,7 +1490,7 @@
     <w:link w:val="Heading3"/>
     <w:uiPriority w:val="9"/>
     <w:semiHidden/>
-    <w:rsid w:val="00917918"/>
+    <w:rsid w:val="006E1922"/>
     <w:rPr>
       <w:rFonts w:cstheme="majorBidi" w:eastAsiaTheme="majorEastAsia"/>
       <w:color w:themeColor="accent1" w:themeShade="BF" w:val="0F4761"/>
@@ -1281,7 +1504,7 @@
     <w:link w:val="Heading4"/>
     <w:uiPriority w:val="9"/>
     <w:semiHidden/>
-    <w:rsid w:val="00917918"/>
+    <w:rsid w:val="006E1922"/>
     <w:rPr>
       <w:rFonts w:cstheme="majorBidi" w:eastAsiaTheme="majorEastAsia"/>
       <w:i/>
@@ -1295,7 +1518,7 @@
     <w:link w:val="Heading5"/>
     <w:uiPriority w:val="9"/>
     <w:semiHidden/>
-    <w:rsid w:val="00917918"/>
+    <w:rsid w:val="006E1922"/>
     <w:rPr>
       <w:rFonts w:cstheme="majorBidi" w:eastAsiaTheme="majorEastAsia"/>
       <w:color w:themeColor="accent1" w:themeShade="BF" w:val="0F4761"/>
@@ -1307,7 +1530,7 @@
     <w:link w:val="Heading6"/>
     <w:uiPriority w:val="9"/>
     <w:semiHidden/>
-    <w:rsid w:val="00917918"/>
+    <w:rsid w:val="006E1922"/>
     <w:rPr>
       <w:rFonts w:cstheme="majorBidi" w:eastAsiaTheme="majorEastAsia"/>
       <w:i/>
@@ -1321,7 +1544,7 @@
     <w:link w:val="Heading7"/>
     <w:uiPriority w:val="9"/>
     <w:semiHidden/>
-    <w:rsid w:val="00917918"/>
+    <w:rsid w:val="006E1922"/>
     <w:rPr>
       <w:rFonts w:cstheme="majorBidi" w:eastAsiaTheme="majorEastAsia"/>
       <w:color w:themeColor="text1" w:themeTint="A6" w:val="595959"/>
@@ -1333,7 +1556,7 @@
     <w:link w:val="Heading8"/>
     <w:uiPriority w:val="9"/>
     <w:semiHidden/>
-    <w:rsid w:val="00917918"/>
+    <w:rsid w:val="006E1922"/>
     <w:rPr>
       <w:rFonts w:cstheme="majorBidi" w:eastAsiaTheme="majorEastAsia"/>
       <w:i/>
@@ -1347,7 +1570,7 @@
     <w:link w:val="Heading9"/>
     <w:uiPriority w:val="9"/>
     <w:semiHidden/>
-    <w:rsid w:val="00917918"/>
+    <w:rsid w:val="006E1922"/>
     <w:rPr>
       <w:rFonts w:cstheme="majorBidi" w:eastAsiaTheme="majorEastAsia"/>
       <w:color w:themeColor="text1" w:themeTint="D8" w:val="272727"/>
@@ -1360,7 +1583,7 @@
     <w:link w:val="TitleChar"/>
     <w:uiPriority w:val="10"/>
     <w:qFormat/>
-    <w:rsid w:val="00917918"/>
+    <w:rsid w:val="006E1922"/>
     <w:pPr>
       <w:spacing w:after="80" w:line="240" w:lineRule="auto"/>
       <w:contextualSpacing/>
@@ -1378,7 +1601,7 @@
     <w:basedOn w:val="DefaultParagraphFont"/>
     <w:link w:val="Title"/>
     <w:uiPriority w:val="10"/>
-    <w:rsid w:val="00917918"/>
+    <w:rsid w:val="006E1922"/>
     <w:rPr>
       <w:rFonts w:asciiTheme="majorHAnsi" w:cstheme="majorBidi" w:eastAsiaTheme="majorEastAsia" w:hAnsiTheme="majorHAnsi"/>
       <w:spacing w:val="-10"/>
@@ -1394,7 +1617,7 @@
     <w:link w:val="SubtitleChar"/>
     <w:uiPriority w:val="11"/>
     <w:qFormat/>
-    <w:rsid w:val="00917918"/>
+    <w:rsid w:val="006E1922"/>
     <w:pPr>
       <w:numPr>
         <w:ilvl w:val="1"/>
@@ -1413,7 +1636,7 @@
     <w:basedOn w:val="DefaultParagraphFont"/>
     <w:link w:val="Subtitle"/>
     <w:uiPriority w:val="11"/>
-    <w:rsid w:val="00917918"/>
+    <w:rsid w:val="006E1922"/>
     <w:rPr>
       <w:rFonts w:cstheme="majorBidi" w:eastAsiaTheme="majorEastAsia"/>
       <w:color w:themeColor="text1" w:themeTint="A6" w:val="595959"/>
@@ -1429,7 +1652,7 @@
     <w:link w:val="QuoteChar"/>
     <w:uiPriority w:val="29"/>
     <w:qFormat/>
-    <w:rsid w:val="00917918"/>
+    <w:rsid w:val="006E1922"/>
     <w:pPr>
       <w:spacing w:before="160"/>
       <w:jc w:val="center"/>
@@ -1445,7 +1668,7 @@
     <w:basedOn w:val="DefaultParagraphFont"/>
     <w:link w:val="Quote"/>
     <w:uiPriority w:val="29"/>
-    <w:rsid w:val="00917918"/>
+    <w:rsid w:val="006E1922"/>
     <w:rPr>
       <w:i/>
       <w:iCs/>
@@ -1457,7 +1680,7 @@
     <w:basedOn w:val="Normal"/>
     <w:uiPriority w:val="34"/>
     <w:qFormat/>
-    <w:rsid w:val="00917918"/>
+    <w:rsid w:val="006E1922"/>
     <w:pPr>
       <w:ind w:left="720"/>
       <w:contextualSpacing/>
@@ -1468,7 +1691,7 @@
     <w:basedOn w:val="DefaultParagraphFont"/>
     <w:uiPriority w:val="21"/>
     <w:qFormat/>
-    <w:rsid w:val="00917918"/>
+    <w:rsid w:val="006E1922"/>
     <w:rPr>
       <w:i/>
       <w:iCs/>
@@ -1482,7 +1705,7 @@
     <w:link w:val="IntenseQuoteChar"/>
     <w:uiPriority w:val="30"/>
     <w:qFormat/>
-    <w:rsid w:val="00917918"/>
+    <w:rsid w:val="006E1922"/>
     <w:pPr>
       <w:pBdr>
         <w:top w:color="0F4761" w:space="10" w:sz="4" w:themeColor="accent1" w:themeShade="BF" w:val="single"/>
@@ -1503,7 +1726,7 @@
     <w:basedOn w:val="DefaultParagraphFont"/>
     <w:link w:val="IntenseQuote"/>
     <w:uiPriority w:val="30"/>
-    <w:rsid w:val="00917918"/>
+    <w:rsid w:val="006E1922"/>
     <w:rPr>
       <w:i/>
       <w:iCs/>
@@ -1515,7 +1738,7 @@
     <w:basedOn w:val="DefaultParagraphFont"/>
     <w:uiPriority w:val="32"/>
     <w:qFormat/>
-    <w:rsid w:val="00917918"/>
+    <w:rsid w:val="006E1922"/>
     <w:rPr>
       <w:b/>
       <w:bCs/>

</xml_diff>